<commit_message>
Added Developer Setup section and platform table kind
- New Developer Setup section split by Windows, macOS and Linux: WSL,
  package managers, Git, GitHub CLI, SSH keys, Node.js, Python, VS Code,
  PowerShell 7, build tools, Docker, execution policy, version checks
- Add kind: 'platform' to the data file; wire it into the DOCX, HTML,
  Markdown builders and the content check
- Map the HTML Show toggles onto the platform columns (Windows follows
  CMD or PowerShell, macOS and Linux follow Bash)
- Add "Setting up Windows for development" notes, tagged to CMD/PowerShell
- Add Git to the subtitle and descriptions
- Link the GitHub Pages site from the README
- Rebuild all outputs
</commit_message>
<xml_diff>
--- a/CLI-Cheat-Sheet.docx
+++ b/CLI-Cheat-Sheet.docx
@@ -140,7 +140,7 @@
           <w:sz w:val="16"/>
           <w:szCs w:val="16"/>
         </w:rPr>
-        <w:t xml:space="preserve">Everyday Essentials  ·  File and Directory Management  ·  Disk and Storage  ·  System and User Information  ·  Processes, Services and Power  ·  Networking and Diagnostics  ·  Environment, History and Shell Basics  ·  Text Processing and Output  ·  Redirection and Piping  ·  Users and Groups  ·  Package Management  ·  Git  ·  Keyboard Shortcuts  ·  Notes and Gotchas</w:t>
+        <w:t xml:space="preserve">Everyday Essentials  ·  File and Directory Management  ·  Disk and Storage  ·  System and User Information  ·  Processes, Services and Power  ·  Networking and Diagnostics  ·  Environment, History and Shell Basics  ·  Text Processing and Output  ·  Redirection and Piping  ·  Users and Groups  ·  Package Management  ·  Developer Setup  ·  Git  ·  Keyboard Shortcuts  ·  Notes and Gotchas</w:t>
       </w:r>
     </w:p>
     <w:p>
@@ -30276,6 +30276,3047 @@
             <w:pPr>
               <w:spacing w:after="0" w:line="240"/>
             </w:pPr>
+          </w:p>
+        </w:tc>
+      </w:tr>
+    </w:tbl>
+    <w:p>
+      <w:pPr>
+        <w:pStyle w:val="Heading2"/>
+        <w:keepNext/>
+        <w:spacing w:after="100" w:before="260"/>
+      </w:pPr>
+      <w:r>
+        <w:t xml:space="preserve">Developer Setup</w:t>
+      </w:r>
+    </w:p>
+    <w:tbl>
+      <w:tblPr>
+        <w:tblW w:type="dxa" w:w="14112"/>
+        <w:tblBorders>
+          <w:top w:val="single" w:color="C9CED6" w:sz="4"/>
+          <w:left w:val="single" w:color="C9CED6" w:sz="4"/>
+          <w:bottom w:val="single" w:color="C9CED6" w:sz="4"/>
+          <w:right w:val="single" w:color="C9CED6" w:sz="4"/>
+          <w:insideH w:val="single" w:color="C9CED6" w:sz="4"/>
+          <w:insideV w:val="single" w:color="C9CED6" w:sz="4"/>
+        </w:tblBorders>
+      </w:tblPr>
+      <w:tblGrid>
+        <w:gridCol w:w="1750"/>
+        <w:gridCol w:w="3250"/>
+        <w:gridCol w:w="3700"/>
+        <w:gridCol w:w="3300"/>
+        <w:gridCol w:w="2112"/>
+      </w:tblGrid>
+      <w:tr>
+        <w:trPr>
+          <w:cantSplit/>
+          <w:tblHeader/>
+        </w:trPr>
+        <w:tc>
+          <w:tcPr>
+            <w:tcW w:type="dxa" w:w="1750"/>
+            <w:shd w:fill="2E3A4B" w:color="auto" w:val="clear"/>
+            <w:tcMar>
+              <w:top w:type="dxa" w:w="50"/>
+              <w:left w:type="dxa" w:w="80"/>
+              <w:bottom w:type="dxa" w:w="50"/>
+              <w:right w:type="dxa" w:w="80"/>
+            </w:tcMar>
+          </w:tcPr>
+          <w:p>
+            <w:pPr>
+              <w:spacing w:after="0"/>
+            </w:pPr>
+            <w:r>
+              <w:rPr>
+                <w:rFonts w:ascii="Calibri" w:cs="Calibri" w:eastAsia="Calibri" w:hAnsi="Calibri"/>
+                <w:b/>
+                <w:bCs/>
+                <w:color w:val="FFFFFF"/>
+                <w:sz w:val="18"/>
+                <w:szCs w:val="18"/>
+              </w:rPr>
+              <w:t xml:space="preserve">Task</w:t>
+            </w:r>
+          </w:p>
+        </w:tc>
+        <w:tc>
+          <w:tcPr>
+            <w:tcW w:type="dxa" w:w="3250"/>
+            <w:shd w:fill="2E3A4B" w:color="auto" w:val="clear"/>
+            <w:tcMar>
+              <w:top w:type="dxa" w:w="50"/>
+              <w:left w:type="dxa" w:w="80"/>
+              <w:bottom w:type="dxa" w:w="50"/>
+              <w:right w:type="dxa" w:w="80"/>
+            </w:tcMar>
+          </w:tcPr>
+          <w:p>
+            <w:pPr>
+              <w:spacing w:after="0"/>
+            </w:pPr>
+            <w:r>
+              <w:rPr>
+                <w:rFonts w:ascii="Calibri" w:cs="Calibri" w:eastAsia="Calibri" w:hAnsi="Calibri"/>
+                <w:b/>
+                <w:bCs/>
+                <w:color w:val="FFFFFF"/>
+                <w:sz w:val="18"/>
+                <w:szCs w:val="18"/>
+              </w:rPr>
+              <w:t xml:space="preserve">Windows</w:t>
+            </w:r>
+          </w:p>
+        </w:tc>
+        <w:tc>
+          <w:tcPr>
+            <w:tcW w:type="dxa" w:w="3700"/>
+            <w:shd w:fill="2E3A4B" w:color="auto" w:val="clear"/>
+            <w:tcMar>
+              <w:top w:type="dxa" w:w="50"/>
+              <w:left w:type="dxa" w:w="80"/>
+              <w:bottom w:type="dxa" w:w="50"/>
+              <w:right w:type="dxa" w:w="80"/>
+            </w:tcMar>
+          </w:tcPr>
+          <w:p>
+            <w:pPr>
+              <w:spacing w:after="0"/>
+            </w:pPr>
+            <w:r>
+              <w:rPr>
+                <w:rFonts w:ascii="Calibri" w:cs="Calibri" w:eastAsia="Calibri" w:hAnsi="Calibri"/>
+                <w:b/>
+                <w:bCs/>
+                <w:color w:val="FFFFFF"/>
+                <w:sz w:val="18"/>
+                <w:szCs w:val="18"/>
+              </w:rPr>
+              <w:t xml:space="preserve">macOS</w:t>
+            </w:r>
+          </w:p>
+        </w:tc>
+        <w:tc>
+          <w:tcPr>
+            <w:tcW w:type="dxa" w:w="3300"/>
+            <w:shd w:fill="2E3A4B" w:color="auto" w:val="clear"/>
+            <w:tcMar>
+              <w:top w:type="dxa" w:w="50"/>
+              <w:left w:type="dxa" w:w="80"/>
+              <w:bottom w:type="dxa" w:w="50"/>
+              <w:right w:type="dxa" w:w="80"/>
+            </w:tcMar>
+          </w:tcPr>
+          <w:p>
+            <w:pPr>
+              <w:spacing w:after="0"/>
+            </w:pPr>
+            <w:r>
+              <w:rPr>
+                <w:rFonts w:ascii="Calibri" w:cs="Calibri" w:eastAsia="Calibri" w:hAnsi="Calibri"/>
+                <w:b/>
+                <w:bCs/>
+                <w:color w:val="FFFFFF"/>
+                <w:sz w:val="18"/>
+                <w:szCs w:val="18"/>
+              </w:rPr>
+              <w:t xml:space="preserve">Linux</w:t>
+            </w:r>
+          </w:p>
+        </w:tc>
+        <w:tc>
+          <w:tcPr>
+            <w:tcW w:type="dxa" w:w="2112"/>
+            <w:shd w:fill="2E3A4B" w:color="auto" w:val="clear"/>
+            <w:tcMar>
+              <w:top w:type="dxa" w:w="50"/>
+              <w:left w:type="dxa" w:w="80"/>
+              <w:bottom w:type="dxa" w:w="50"/>
+              <w:right w:type="dxa" w:w="80"/>
+            </w:tcMar>
+          </w:tcPr>
+          <w:p>
+            <w:pPr>
+              <w:spacing w:after="0"/>
+            </w:pPr>
+            <w:r>
+              <w:rPr>
+                <w:rFonts w:ascii="Calibri" w:cs="Calibri" w:eastAsia="Calibri" w:hAnsi="Calibri"/>
+                <w:b/>
+                <w:bCs/>
+                <w:color w:val="FFFFFF"/>
+                <w:sz w:val="18"/>
+                <w:szCs w:val="18"/>
+              </w:rPr>
+              <w:t xml:space="preserve">Notes</w:t>
+            </w:r>
+          </w:p>
+        </w:tc>
+      </w:tr>
+      <w:tr>
+        <w:trPr>
+          <w:cantSplit/>
+        </w:trPr>
+        <w:tc>
+          <w:tcPr>
+            <w:tcW w:type="dxa" w:w="1750"/>
+            <w:tcMar>
+              <w:top w:type="dxa" w:w="50"/>
+              <w:left w:type="dxa" w:w="80"/>
+              <w:bottom w:type="dxa" w:w="50"/>
+              <w:right w:type="dxa" w:w="80"/>
+            </w:tcMar>
+          </w:tcPr>
+          <w:p>
+            <w:pPr>
+              <w:spacing w:after="0"/>
+            </w:pPr>
+            <w:r>
+              <w:rPr>
+                <w:rFonts w:ascii="Calibri" w:cs="Calibri" w:eastAsia="Calibri" w:hAnsi="Calibri"/>
+                <w:b/>
+                <w:bCs/>
+                <w:sz w:val="18"/>
+                <w:szCs w:val="18"/>
+              </w:rPr>
+              <w:t xml:space="preserve">Install WSL (Linux on Windows)</w:t>
+            </w:r>
+          </w:p>
+        </w:tc>
+        <w:tc>
+          <w:tcPr>
+            <w:tcW w:type="dxa" w:w="3250"/>
+            <w:tcMar>
+              <w:top w:type="dxa" w:w="50"/>
+              <w:left w:type="dxa" w:w="80"/>
+              <w:bottom w:type="dxa" w:w="50"/>
+              <w:right w:type="dxa" w:w="80"/>
+            </w:tcMar>
+          </w:tcPr>
+          <w:p>
+            <w:pPr>
+              <w:spacing w:after="30" w:line="240"/>
+            </w:pPr>
+            <w:r>
+              <w:rPr>
+                <w:rFonts w:ascii="Consolas" w:cs="Consolas" w:eastAsia="Consolas" w:hAnsi="Consolas"/>
+                <w:color w:val="1F2937"/>
+                <w:sz w:val="17"/>
+                <w:szCs w:val="17"/>
+              </w:rPr>
+              <w:t xml:space="preserve">wsl --install</w:t>
+            </w:r>
+            <w:r>
+              <w:rPr>
+                <w:sz w:val="17"/>
+                <w:szCs w:val="17"/>
+              </w:rPr>
+              <w:t xml:space="preserve"> </w:t>
+            </w:r>
+            <w:r>
+              <w:rPr>
+                <w:rFonts w:ascii="Calibri" w:cs="Calibri" w:eastAsia="Calibri" w:hAnsi="Calibri"/>
+                <w:i/>
+                <w:iCs/>
+                <w:color w:val="6B7280"/>
+                <w:sz w:val="16"/>
+                <w:szCs w:val="16"/>
+              </w:rPr>
+              <w:t xml:space="preserve">(Ubuntu by default; reboot afterwards)</w:t>
+            </w:r>
+          </w:p>
+          <w:p>
+            <w:pPr>
+              <w:spacing w:after="30" w:line="240"/>
+            </w:pPr>
+            <w:r>
+              <w:rPr>
+                <w:rFonts w:ascii="Consolas" w:cs="Consolas" w:eastAsia="Consolas" w:hAnsi="Consolas"/>
+                <w:color w:val="1F2937"/>
+                <w:sz w:val="17"/>
+                <w:szCs w:val="17"/>
+              </w:rPr>
+              <w:t xml:space="preserve">wsl --install -d Debian</w:t>
+            </w:r>
+            <w:r>
+              <w:rPr>
+                <w:sz w:val="17"/>
+                <w:szCs w:val="17"/>
+              </w:rPr>
+              <w:t xml:space="preserve"> </w:t>
+            </w:r>
+            <w:r>
+              <w:rPr>
+                <w:rFonts w:ascii="Calibri" w:cs="Calibri" w:eastAsia="Calibri" w:hAnsi="Calibri"/>
+                <w:i/>
+                <w:iCs/>
+                <w:color w:val="6B7280"/>
+                <w:sz w:val="16"/>
+                <w:szCs w:val="16"/>
+              </w:rPr>
+              <w:t xml:space="preserve">(pick a distro)</w:t>
+            </w:r>
+          </w:p>
+          <w:p>
+            <w:pPr>
+              <w:spacing w:after="30" w:line="240"/>
+            </w:pPr>
+            <w:r>
+              <w:rPr>
+                <w:rFonts w:ascii="Consolas" w:cs="Consolas" w:eastAsia="Consolas" w:hAnsi="Consolas"/>
+                <w:color w:val="1F2937"/>
+                <w:sz w:val="17"/>
+                <w:szCs w:val="17"/>
+              </w:rPr>
+              <w:t xml:space="preserve">wsl -l -v</w:t>
+            </w:r>
+            <w:r>
+              <w:rPr>
+                <w:sz w:val="17"/>
+                <w:szCs w:val="17"/>
+              </w:rPr>
+              <w:t xml:space="preserve"> </w:t>
+            </w:r>
+            <w:r>
+              <w:rPr>
+                <w:rFonts w:ascii="Calibri" w:cs="Calibri" w:eastAsia="Calibri" w:hAnsi="Calibri"/>
+                <w:i/>
+                <w:iCs/>
+                <w:color w:val="6B7280"/>
+                <w:sz w:val="16"/>
+                <w:szCs w:val="16"/>
+              </w:rPr>
+              <w:t xml:space="preserve">(list distros and versions)</w:t>
+            </w:r>
+          </w:p>
+          <w:p>
+            <w:pPr>
+              <w:spacing w:after="30" w:line="240"/>
+            </w:pPr>
+            <w:r>
+              <w:rPr>
+                <w:rFonts w:ascii="Consolas" w:cs="Consolas" w:eastAsia="Consolas" w:hAnsi="Consolas"/>
+                <w:color w:val="1F2937"/>
+                <w:sz w:val="17"/>
+                <w:szCs w:val="17"/>
+              </w:rPr>
+              <w:t xml:space="preserve">wsl --update</w:t>
+            </w:r>
+          </w:p>
+          <w:p>
+            <w:pPr>
+              <w:spacing w:after="30" w:line="240"/>
+            </w:pPr>
+            <w:r>
+              <w:rPr>
+                <w:rFonts w:ascii="Consolas" w:cs="Consolas" w:eastAsia="Consolas" w:hAnsi="Consolas"/>
+                <w:color w:val="1F2937"/>
+                <w:sz w:val="17"/>
+                <w:szCs w:val="17"/>
+              </w:rPr>
+              <w:t xml:space="preserve">wsl --shutdown</w:t>
+            </w:r>
+          </w:p>
+          <w:p>
+            <w:pPr>
+              <w:spacing w:after="30" w:line="240"/>
+            </w:pPr>
+            <w:r>
+              <w:rPr>
+                <w:rFonts w:ascii="Consolas" w:cs="Consolas" w:eastAsia="Consolas" w:hAnsi="Consolas"/>
+                <w:color w:val="1F2937"/>
+                <w:sz w:val="17"/>
+                <w:szCs w:val="17"/>
+              </w:rPr>
+              <w:t xml:space="preserve">wsl</w:t>
+            </w:r>
+            <w:r>
+              <w:rPr>
+                <w:sz w:val="17"/>
+                <w:szCs w:val="17"/>
+              </w:rPr>
+              <w:t xml:space="preserve"> </w:t>
+            </w:r>
+            <w:r>
+              <w:rPr>
+                <w:rFonts w:ascii="Calibri" w:cs="Calibri" w:eastAsia="Calibri" w:hAnsi="Calibri"/>
+                <w:i/>
+                <w:iCs/>
+                <w:color w:val="6B7280"/>
+                <w:sz w:val="16"/>
+                <w:szCs w:val="16"/>
+              </w:rPr>
+              <w:t xml:space="preserve">(open the default distro)</w:t>
+            </w:r>
+          </w:p>
+        </w:tc>
+        <w:tc>
+          <w:tcPr>
+            <w:tcW w:type="dxa" w:w="3700"/>
+            <w:tcMar>
+              <w:top w:type="dxa" w:w="50"/>
+              <w:left w:type="dxa" w:w="80"/>
+              <w:bottom w:type="dxa" w:w="50"/>
+              <w:right w:type="dxa" w:w="80"/>
+            </w:tcMar>
+          </w:tcPr>
+          <w:p>
+            <w:pPr>
+              <w:spacing w:after="30" w:line="240"/>
+            </w:pPr>
+            <w:r>
+              <w:rPr>
+                <w:rFonts w:ascii="Calibri" w:cs="Calibri" w:eastAsia="Calibri" w:hAnsi="Calibri"/>
+                <w:i/>
+                <w:iCs/>
+                <w:color w:val="6B7280"/>
+                <w:sz w:val="16"/>
+                <w:szCs w:val="16"/>
+              </w:rPr>
+              <w:t xml:space="preserve">(not needed; macOS is already Unix)</w:t>
+            </w:r>
+          </w:p>
+        </w:tc>
+        <w:tc>
+          <w:tcPr>
+            <w:tcW w:type="dxa" w:w="3300"/>
+            <w:tcMar>
+              <w:top w:type="dxa" w:w="50"/>
+              <w:left w:type="dxa" w:w="80"/>
+              <w:bottom w:type="dxa" w:w="50"/>
+              <w:right w:type="dxa" w:w="80"/>
+            </w:tcMar>
+          </w:tcPr>
+          <w:p>
+            <w:pPr>
+              <w:spacing w:after="30" w:line="240"/>
+            </w:pPr>
+            <w:r>
+              <w:rPr>
+                <w:rFonts w:ascii="Calibri" w:cs="Calibri" w:eastAsia="Calibri" w:hAnsi="Calibri"/>
+                <w:i/>
+                <w:iCs/>
+                <w:color w:val="6B7280"/>
+                <w:sz w:val="16"/>
+                <w:szCs w:val="16"/>
+              </w:rPr>
+              <w:t xml:space="preserve">(not needed)</w:t>
+            </w:r>
+          </w:p>
+        </w:tc>
+        <w:tc>
+          <w:tcPr>
+            <w:tcW w:type="dxa" w:w="2112"/>
+            <w:tcMar>
+              <w:top w:type="dxa" w:w="50"/>
+              <w:left w:type="dxa" w:w="80"/>
+              <w:bottom w:type="dxa" w:w="50"/>
+              <w:right w:type="dxa" w:w="80"/>
+            </w:tcMar>
+          </w:tcPr>
+          <w:p>
+            <w:pPr>
+              <w:spacing w:after="0" w:line="240"/>
+            </w:pPr>
+            <w:r>
+              <w:rPr>
+                <w:rFonts w:ascii="Segoe UI Emoji" w:cs="Segoe UI Emoji" w:eastAsia="Segoe UI Emoji" w:hAnsi="Segoe UI Emoji"/>
+                <w:sz w:val="16"/>
+                <w:szCs w:val="16"/>
+              </w:rPr>
+              <w:t xml:space="preserve">🔒</w:t>
+            </w:r>
+            <w:r>
+              <w:rPr>
+                <w:rFonts w:ascii="Calibri" w:cs="Calibri" w:eastAsia="Calibri" w:hAnsi="Calibri"/>
+                <w:sz w:val="16"/>
+                <w:szCs w:val="16"/>
+              </w:rPr>
+              <w:t xml:space="preserve"> Run from an administrator prompt. Inside WSL, Windows drives are under /mnt/c and Windows tools are on the PATH, so code . opens VS Code.</w:t>
+            </w:r>
+          </w:p>
+        </w:tc>
+      </w:tr>
+      <w:tr>
+        <w:trPr>
+          <w:cantSplit/>
+        </w:trPr>
+        <w:tc>
+          <w:tcPr>
+            <w:tcW w:type="dxa" w:w="1750"/>
+            <w:shd w:fill="F3F5F7" w:color="auto" w:val="clear"/>
+            <w:tcMar>
+              <w:top w:type="dxa" w:w="50"/>
+              <w:left w:type="dxa" w:w="80"/>
+              <w:bottom w:type="dxa" w:w="50"/>
+              <w:right w:type="dxa" w:w="80"/>
+            </w:tcMar>
+          </w:tcPr>
+          <w:p>
+            <w:pPr>
+              <w:spacing w:after="0"/>
+            </w:pPr>
+            <w:r>
+              <w:rPr>
+                <w:rFonts w:ascii="Calibri" w:cs="Calibri" w:eastAsia="Calibri" w:hAnsi="Calibri"/>
+                <w:b/>
+                <w:bCs/>
+                <w:sz w:val="18"/>
+                <w:szCs w:val="18"/>
+              </w:rPr>
+              <w:t xml:space="preserve">Package manager</w:t>
+            </w:r>
+          </w:p>
+        </w:tc>
+        <w:tc>
+          <w:tcPr>
+            <w:tcW w:type="dxa" w:w="3250"/>
+            <w:shd w:fill="F3F5F7" w:color="auto" w:val="clear"/>
+            <w:tcMar>
+              <w:top w:type="dxa" w:w="50"/>
+              <w:left w:type="dxa" w:w="80"/>
+              <w:bottom w:type="dxa" w:w="50"/>
+              <w:right w:type="dxa" w:w="80"/>
+            </w:tcMar>
+          </w:tcPr>
+          <w:p>
+            <w:pPr>
+              <w:spacing w:after="30" w:line="240"/>
+            </w:pPr>
+            <w:r>
+              <w:rPr>
+                <w:rFonts w:ascii="Consolas" w:cs="Consolas" w:eastAsia="Consolas" w:hAnsi="Consolas"/>
+                <w:color w:val="1F2937"/>
+                <w:sz w:val="17"/>
+                <w:szCs w:val="17"/>
+              </w:rPr>
+              <w:t xml:space="preserve">winget --version</w:t>
+            </w:r>
+            <w:r>
+              <w:rPr>
+                <w:sz w:val="17"/>
+                <w:szCs w:val="17"/>
+              </w:rPr>
+              <w:t xml:space="preserve"> </w:t>
+            </w:r>
+            <w:r>
+              <w:rPr>
+                <w:rFonts w:ascii="Calibri" w:cs="Calibri" w:eastAsia="Calibri" w:hAnsi="Calibri"/>
+                <w:i/>
+                <w:iCs/>
+                <w:color w:val="6B7280"/>
+                <w:sz w:val="16"/>
+                <w:szCs w:val="16"/>
+              </w:rPr>
+              <w:t xml:space="preserve">(built in on Windows 10 1709+ and 11)</w:t>
+            </w:r>
+          </w:p>
+          <w:p>
+            <w:pPr>
+              <w:spacing w:after="30" w:line="240"/>
+            </w:pPr>
+            <w:r>
+              <w:rPr>
+                <w:rFonts w:ascii="Consolas" w:cs="Consolas" w:eastAsia="Consolas" w:hAnsi="Consolas"/>
+                <w:color w:val="1F2937"/>
+                <w:sz w:val="17"/>
+                <w:szCs w:val="17"/>
+              </w:rPr>
+              <w:t xml:space="preserve">winget source update</w:t>
+            </w:r>
+          </w:p>
+          <w:p>
+            <w:pPr>
+              <w:spacing w:after="30" w:line="240"/>
+            </w:pPr>
+            <w:r>
+              <w:rPr>
+                <w:rFonts w:ascii="Calibri" w:cs="Calibri" w:eastAsia="Calibri" w:hAnsi="Calibri"/>
+                <w:i/>
+                <w:iCs/>
+                <w:color w:val="6B7280"/>
+                <w:sz w:val="16"/>
+                <w:szCs w:val="16"/>
+              </w:rPr>
+              <w:t xml:space="preserve">(Chocolatey is optional: see chocolatey.org/install)</w:t>
+            </w:r>
+          </w:p>
+        </w:tc>
+        <w:tc>
+          <w:tcPr>
+            <w:tcW w:type="dxa" w:w="3700"/>
+            <w:shd w:fill="F3F5F7" w:color="auto" w:val="clear"/>
+            <w:tcMar>
+              <w:top w:type="dxa" w:w="50"/>
+              <w:left w:type="dxa" w:w="80"/>
+              <w:bottom w:type="dxa" w:w="50"/>
+              <w:right w:type="dxa" w:w="80"/>
+            </w:tcMar>
+          </w:tcPr>
+          <w:p>
+            <w:pPr>
+              <w:spacing w:after="30" w:line="240"/>
+            </w:pPr>
+            <w:r>
+              <w:rPr>
+                <w:rFonts w:ascii="Consolas" w:cs="Consolas" w:eastAsia="Consolas" w:hAnsi="Consolas"/>
+                <w:color w:val="1F2937"/>
+                <w:sz w:val="17"/>
+                <w:szCs w:val="17"/>
+              </w:rPr>
+              <w:t xml:space="preserve">/bin/bash -c "$(curl -fsSL https://raw.githubusercontent.com/Homebrew/install/HEAD/install.sh)"</w:t>
+            </w:r>
+          </w:p>
+          <w:p>
+            <w:pPr>
+              <w:spacing w:after="30" w:line="240"/>
+            </w:pPr>
+            <w:r>
+              <w:rPr>
+                <w:rFonts w:ascii="Consolas" w:cs="Consolas" w:eastAsia="Consolas" w:hAnsi="Consolas"/>
+                <w:color w:val="1F2937"/>
+                <w:sz w:val="17"/>
+                <w:szCs w:val="17"/>
+              </w:rPr>
+              <w:t xml:space="preserve">brew doctor</w:t>
+            </w:r>
+          </w:p>
+        </w:tc>
+        <w:tc>
+          <w:tcPr>
+            <w:tcW w:type="dxa" w:w="3300"/>
+            <w:shd w:fill="F3F5F7" w:color="auto" w:val="clear"/>
+            <w:tcMar>
+              <w:top w:type="dxa" w:w="50"/>
+              <w:left w:type="dxa" w:w="80"/>
+              <w:bottom w:type="dxa" w:w="50"/>
+              <w:right w:type="dxa" w:w="80"/>
+            </w:tcMar>
+          </w:tcPr>
+          <w:p>
+            <w:pPr>
+              <w:spacing w:after="30" w:line="240"/>
+            </w:pPr>
+            <w:r>
+              <w:rPr>
+                <w:rFonts w:ascii="Calibri" w:cs="Calibri" w:eastAsia="Calibri" w:hAnsi="Calibri"/>
+                <w:i/>
+                <w:iCs/>
+                <w:color w:val="6B7280"/>
+                <w:sz w:val="16"/>
+                <w:szCs w:val="16"/>
+              </w:rPr>
+              <w:t xml:space="preserve">(apt, dnf or pacman is already installed)</w:t>
+            </w:r>
+          </w:p>
+          <w:p>
+            <w:pPr>
+              <w:spacing w:after="30" w:line="240"/>
+            </w:pPr>
+            <w:r>
+              <w:rPr>
+                <w:rFonts w:ascii="Consolas" w:cs="Consolas" w:eastAsia="Consolas" w:hAnsi="Consolas"/>
+                <w:color w:val="1F2937"/>
+                <w:sz w:val="17"/>
+                <w:szCs w:val="17"/>
+              </w:rPr>
+              <w:t xml:space="preserve">sudo apt update</w:t>
+            </w:r>
+            <w:r>
+              <w:rPr>
+                <w:sz w:val="17"/>
+                <w:szCs w:val="17"/>
+              </w:rPr>
+              <w:t xml:space="preserve"> </w:t>
+            </w:r>
+            <w:r>
+              <w:rPr>
+                <w:rFonts w:ascii="Calibri" w:cs="Calibri" w:eastAsia="Calibri" w:hAnsi="Calibri"/>
+                <w:i/>
+                <w:iCs/>
+                <w:color w:val="6B7280"/>
+                <w:sz w:val="16"/>
+                <w:szCs w:val="16"/>
+              </w:rPr>
+              <w:t xml:space="preserve">(refresh the index first)</w:t>
+            </w:r>
+          </w:p>
+        </w:tc>
+        <w:tc>
+          <w:tcPr>
+            <w:tcW w:type="dxa" w:w="2112"/>
+            <w:shd w:fill="F3F5F7" w:color="auto" w:val="clear"/>
+            <w:tcMar>
+              <w:top w:type="dxa" w:w="50"/>
+              <w:left w:type="dxa" w:w="80"/>
+              <w:bottom w:type="dxa" w:w="50"/>
+              <w:right w:type="dxa" w:w="80"/>
+            </w:tcMar>
+          </w:tcPr>
+          <w:p>
+            <w:pPr>
+              <w:spacing w:after="0" w:line="240"/>
+            </w:pPr>
+            <w:r>
+              <w:rPr>
+                <w:rFonts w:ascii="Calibri" w:cs="Calibri" w:eastAsia="Calibri" w:hAnsi="Calibri"/>
+                <w:sz w:val="16"/>
+                <w:szCs w:val="16"/>
+              </w:rPr>
+              <w:t xml:space="preserve">If winget is missing, install "App Installer" from the Microsoft Store.</w:t>
+            </w:r>
+          </w:p>
+        </w:tc>
+      </w:tr>
+      <w:tr>
+        <w:trPr>
+          <w:cantSplit/>
+        </w:trPr>
+        <w:tc>
+          <w:tcPr>
+            <w:tcW w:type="dxa" w:w="1750"/>
+            <w:tcMar>
+              <w:top w:type="dxa" w:w="50"/>
+              <w:left w:type="dxa" w:w="80"/>
+              <w:bottom w:type="dxa" w:w="50"/>
+              <w:right w:type="dxa" w:w="80"/>
+            </w:tcMar>
+          </w:tcPr>
+          <w:p>
+            <w:pPr>
+              <w:spacing w:after="0"/>
+            </w:pPr>
+            <w:r>
+              <w:rPr>
+                <w:rFonts w:ascii="Calibri" w:cs="Calibri" w:eastAsia="Calibri" w:hAnsi="Calibri"/>
+                <w:b/>
+                <w:bCs/>
+                <w:sz w:val="18"/>
+                <w:szCs w:val="18"/>
+              </w:rPr>
+              <w:t xml:space="preserve">Git</w:t>
+            </w:r>
+          </w:p>
+        </w:tc>
+        <w:tc>
+          <w:tcPr>
+            <w:tcW w:type="dxa" w:w="3250"/>
+            <w:tcMar>
+              <w:top w:type="dxa" w:w="50"/>
+              <w:left w:type="dxa" w:w="80"/>
+              <w:bottom w:type="dxa" w:w="50"/>
+              <w:right w:type="dxa" w:w="80"/>
+            </w:tcMar>
+          </w:tcPr>
+          <w:p>
+            <w:pPr>
+              <w:spacing w:after="30" w:line="240"/>
+            </w:pPr>
+            <w:r>
+              <w:rPr>
+                <w:rFonts w:ascii="Consolas" w:cs="Consolas" w:eastAsia="Consolas" w:hAnsi="Consolas"/>
+                <w:color w:val="1F2937"/>
+                <w:sz w:val="17"/>
+                <w:szCs w:val="17"/>
+              </w:rPr>
+              <w:t xml:space="preserve">winget install --id Git.Git -e</w:t>
+            </w:r>
+          </w:p>
+          <w:p>
+            <w:pPr>
+              <w:spacing w:after="30" w:line="240"/>
+            </w:pPr>
+            <w:r>
+              <w:rPr>
+                <w:rFonts w:ascii="Consolas" w:cs="Consolas" w:eastAsia="Consolas" w:hAnsi="Consolas"/>
+                <w:color w:val="1F2937"/>
+                <w:sz w:val="17"/>
+                <w:szCs w:val="17"/>
+              </w:rPr>
+              <w:t xml:space="preserve">git --version</w:t>
+            </w:r>
+          </w:p>
+        </w:tc>
+        <w:tc>
+          <w:tcPr>
+            <w:tcW w:type="dxa" w:w="3700"/>
+            <w:tcMar>
+              <w:top w:type="dxa" w:w="50"/>
+              <w:left w:type="dxa" w:w="80"/>
+              <w:bottom w:type="dxa" w:w="50"/>
+              <w:right w:type="dxa" w:w="80"/>
+            </w:tcMar>
+          </w:tcPr>
+          <w:p>
+            <w:pPr>
+              <w:spacing w:after="30" w:line="240"/>
+            </w:pPr>
+            <w:r>
+              <w:rPr>
+                <w:rFonts w:ascii="Consolas" w:cs="Consolas" w:eastAsia="Consolas" w:hAnsi="Consolas"/>
+                <w:color w:val="1F2937"/>
+                <w:sz w:val="17"/>
+                <w:szCs w:val="17"/>
+              </w:rPr>
+              <w:t xml:space="preserve">xcode-select --install</w:t>
+            </w:r>
+            <w:r>
+              <w:rPr>
+                <w:sz w:val="17"/>
+                <w:szCs w:val="17"/>
+              </w:rPr>
+              <w:t xml:space="preserve"> </w:t>
+            </w:r>
+            <w:r>
+              <w:rPr>
+                <w:rFonts w:ascii="Calibri" w:cs="Calibri" w:eastAsia="Calibri" w:hAnsi="Calibri"/>
+                <w:i/>
+                <w:iCs/>
+                <w:color w:val="6B7280"/>
+                <w:sz w:val="16"/>
+                <w:szCs w:val="16"/>
+              </w:rPr>
+              <w:t xml:space="preserve">(Apple's git plus compilers)</w:t>
+            </w:r>
+          </w:p>
+          <w:p>
+            <w:pPr>
+              <w:spacing w:after="30" w:line="240"/>
+            </w:pPr>
+            <w:r>
+              <w:rPr>
+                <w:rFonts w:ascii="Consolas" w:cs="Consolas" w:eastAsia="Consolas" w:hAnsi="Consolas"/>
+                <w:color w:val="1F2937"/>
+                <w:sz w:val="17"/>
+                <w:szCs w:val="17"/>
+              </w:rPr>
+              <w:t xml:space="preserve">brew install git</w:t>
+            </w:r>
+            <w:r>
+              <w:rPr>
+                <w:sz w:val="17"/>
+                <w:szCs w:val="17"/>
+              </w:rPr>
+              <w:t xml:space="preserve"> </w:t>
+            </w:r>
+            <w:r>
+              <w:rPr>
+                <w:rFonts w:ascii="Calibri" w:cs="Calibri" w:eastAsia="Calibri" w:hAnsi="Calibri"/>
+                <w:i/>
+                <w:iCs/>
+                <w:color w:val="6B7280"/>
+                <w:sz w:val="16"/>
+                <w:szCs w:val="16"/>
+              </w:rPr>
+              <w:t xml:space="preserve">(newer version)</w:t>
+            </w:r>
+          </w:p>
+        </w:tc>
+        <w:tc>
+          <w:tcPr>
+            <w:tcW w:type="dxa" w:w="3300"/>
+            <w:tcMar>
+              <w:top w:type="dxa" w:w="50"/>
+              <w:left w:type="dxa" w:w="80"/>
+              <w:bottom w:type="dxa" w:w="50"/>
+              <w:right w:type="dxa" w:w="80"/>
+            </w:tcMar>
+          </w:tcPr>
+          <w:p>
+            <w:pPr>
+              <w:spacing w:after="30" w:line="240"/>
+            </w:pPr>
+            <w:r>
+              <w:rPr>
+                <w:rFonts w:ascii="Consolas" w:cs="Consolas" w:eastAsia="Consolas" w:hAnsi="Consolas"/>
+                <w:color w:val="1F2937"/>
+                <w:sz w:val="17"/>
+                <w:szCs w:val="17"/>
+              </w:rPr>
+              <w:t xml:space="preserve">sudo apt install git</w:t>
+            </w:r>
+          </w:p>
+          <w:p>
+            <w:pPr>
+              <w:spacing w:after="30" w:line="240"/>
+            </w:pPr>
+            <w:r>
+              <w:rPr>
+                <w:rFonts w:ascii="Consolas" w:cs="Consolas" w:eastAsia="Consolas" w:hAnsi="Consolas"/>
+                <w:color w:val="1F2937"/>
+                <w:sz w:val="17"/>
+                <w:szCs w:val="17"/>
+              </w:rPr>
+              <w:t xml:space="preserve">sudo dnf install git</w:t>
+            </w:r>
+          </w:p>
+        </w:tc>
+        <w:tc>
+          <w:tcPr>
+            <w:tcW w:type="dxa" w:w="2112"/>
+            <w:tcMar>
+              <w:top w:type="dxa" w:w="50"/>
+              <w:left w:type="dxa" w:w="80"/>
+              <w:bottom w:type="dxa" w:w="50"/>
+              <w:right w:type="dxa" w:w="80"/>
+            </w:tcMar>
+          </w:tcPr>
+          <w:p>
+            <w:pPr>
+              <w:spacing w:after="0" w:line="240"/>
+            </w:pPr>
+            <w:r>
+              <w:rPr>
+                <w:rFonts w:ascii="Calibri" w:cs="Calibri" w:eastAsia="Calibri" w:hAnsi="Calibri"/>
+                <w:sz w:val="16"/>
+                <w:szCs w:val="16"/>
+              </w:rPr>
+              <w:t xml:space="preserve">On Windows this also installs Git Bash.</w:t>
+            </w:r>
+          </w:p>
+        </w:tc>
+      </w:tr>
+      <w:tr>
+        <w:trPr>
+          <w:cantSplit/>
+        </w:trPr>
+        <w:tc>
+          <w:tcPr>
+            <w:tcW w:type="dxa" w:w="1750"/>
+            <w:shd w:fill="F3F5F7" w:color="auto" w:val="clear"/>
+            <w:tcMar>
+              <w:top w:type="dxa" w:w="50"/>
+              <w:left w:type="dxa" w:w="80"/>
+              <w:bottom w:type="dxa" w:w="50"/>
+              <w:right w:type="dxa" w:w="80"/>
+            </w:tcMar>
+          </w:tcPr>
+          <w:p>
+            <w:pPr>
+              <w:spacing w:after="0"/>
+            </w:pPr>
+            <w:r>
+              <w:rPr>
+                <w:rFonts w:ascii="Calibri" w:cs="Calibri" w:eastAsia="Calibri" w:hAnsi="Calibri"/>
+                <w:b/>
+                <w:bCs/>
+                <w:sz w:val="18"/>
+                <w:szCs w:val="18"/>
+              </w:rPr>
+              <w:t xml:space="preserve">GitHub CLI</w:t>
+            </w:r>
+          </w:p>
+        </w:tc>
+        <w:tc>
+          <w:tcPr>
+            <w:tcW w:type="dxa" w:w="3250"/>
+            <w:shd w:fill="F3F5F7" w:color="auto" w:val="clear"/>
+            <w:tcMar>
+              <w:top w:type="dxa" w:w="50"/>
+              <w:left w:type="dxa" w:w="80"/>
+              <w:bottom w:type="dxa" w:w="50"/>
+              <w:right w:type="dxa" w:w="80"/>
+            </w:tcMar>
+          </w:tcPr>
+          <w:p>
+            <w:pPr>
+              <w:spacing w:after="30" w:line="240"/>
+            </w:pPr>
+            <w:r>
+              <w:rPr>
+                <w:rFonts w:ascii="Consolas" w:cs="Consolas" w:eastAsia="Consolas" w:hAnsi="Consolas"/>
+                <w:color w:val="1F2937"/>
+                <w:sz w:val="17"/>
+                <w:szCs w:val="17"/>
+              </w:rPr>
+              <w:t xml:space="preserve">winget install --id GitHub.cli -e</w:t>
+            </w:r>
+          </w:p>
+          <w:p>
+            <w:pPr>
+              <w:spacing w:after="30" w:line="240"/>
+            </w:pPr>
+            <w:r>
+              <w:rPr>
+                <w:rFonts w:ascii="Consolas" w:cs="Consolas" w:eastAsia="Consolas" w:hAnsi="Consolas"/>
+                <w:color w:val="1F2937"/>
+                <w:sz w:val="17"/>
+                <w:szCs w:val="17"/>
+              </w:rPr>
+              <w:t xml:space="preserve">gh auth login</w:t>
+            </w:r>
+          </w:p>
+        </w:tc>
+        <w:tc>
+          <w:tcPr>
+            <w:tcW w:type="dxa" w:w="3700"/>
+            <w:shd w:fill="F3F5F7" w:color="auto" w:val="clear"/>
+            <w:tcMar>
+              <w:top w:type="dxa" w:w="50"/>
+              <w:left w:type="dxa" w:w="80"/>
+              <w:bottom w:type="dxa" w:w="50"/>
+              <w:right w:type="dxa" w:w="80"/>
+            </w:tcMar>
+          </w:tcPr>
+          <w:p>
+            <w:pPr>
+              <w:spacing w:after="30" w:line="240"/>
+            </w:pPr>
+            <w:r>
+              <w:rPr>
+                <w:rFonts w:ascii="Consolas" w:cs="Consolas" w:eastAsia="Consolas" w:hAnsi="Consolas"/>
+                <w:color w:val="1F2937"/>
+                <w:sz w:val="17"/>
+                <w:szCs w:val="17"/>
+              </w:rPr>
+              <w:t xml:space="preserve">brew install gh</w:t>
+            </w:r>
+          </w:p>
+          <w:p>
+            <w:pPr>
+              <w:spacing w:after="30" w:line="240"/>
+            </w:pPr>
+            <w:r>
+              <w:rPr>
+                <w:rFonts w:ascii="Consolas" w:cs="Consolas" w:eastAsia="Consolas" w:hAnsi="Consolas"/>
+                <w:color w:val="1F2937"/>
+                <w:sz w:val="17"/>
+                <w:szCs w:val="17"/>
+              </w:rPr>
+              <w:t xml:space="preserve">gh auth login</w:t>
+            </w:r>
+          </w:p>
+        </w:tc>
+        <w:tc>
+          <w:tcPr>
+            <w:tcW w:type="dxa" w:w="3300"/>
+            <w:shd w:fill="F3F5F7" w:color="auto" w:val="clear"/>
+            <w:tcMar>
+              <w:top w:type="dxa" w:w="50"/>
+              <w:left w:type="dxa" w:w="80"/>
+              <w:bottom w:type="dxa" w:w="50"/>
+              <w:right w:type="dxa" w:w="80"/>
+            </w:tcMar>
+          </w:tcPr>
+          <w:p>
+            <w:pPr>
+              <w:spacing w:after="30" w:line="240"/>
+            </w:pPr>
+            <w:r>
+              <w:rPr>
+                <w:rFonts w:ascii="Consolas" w:cs="Consolas" w:eastAsia="Consolas" w:hAnsi="Consolas"/>
+                <w:color w:val="1F2937"/>
+                <w:sz w:val="17"/>
+                <w:szCs w:val="17"/>
+              </w:rPr>
+              <w:t xml:space="preserve">sudo apt install gh</w:t>
+            </w:r>
+            <w:r>
+              <w:rPr>
+                <w:sz w:val="17"/>
+                <w:szCs w:val="17"/>
+              </w:rPr>
+              <w:t xml:space="preserve"> </w:t>
+            </w:r>
+            <w:r>
+              <w:rPr>
+                <w:rFonts w:ascii="Calibri" w:cs="Calibri" w:eastAsia="Calibri" w:hAnsi="Calibri"/>
+                <w:i/>
+                <w:iCs/>
+                <w:color w:val="6B7280"/>
+                <w:sz w:val="16"/>
+                <w:szCs w:val="16"/>
+              </w:rPr>
+              <w:t xml:space="preserve">(Ubuntu 23.04+; older distros: see cli.github.com)</w:t>
+            </w:r>
+          </w:p>
+          <w:p>
+            <w:pPr>
+              <w:spacing w:after="30" w:line="240"/>
+            </w:pPr>
+            <w:r>
+              <w:rPr>
+                <w:rFonts w:ascii="Consolas" w:cs="Consolas" w:eastAsia="Consolas" w:hAnsi="Consolas"/>
+                <w:color w:val="1F2937"/>
+                <w:sz w:val="17"/>
+                <w:szCs w:val="17"/>
+              </w:rPr>
+              <w:t xml:space="preserve">gh auth login</w:t>
+            </w:r>
+          </w:p>
+        </w:tc>
+        <w:tc>
+          <w:tcPr>
+            <w:tcW w:type="dxa" w:w="2112"/>
+            <w:shd w:fill="F3F5F7" w:color="auto" w:val="clear"/>
+            <w:tcMar>
+              <w:top w:type="dxa" w:w="50"/>
+              <w:left w:type="dxa" w:w="80"/>
+              <w:bottom w:type="dxa" w:w="50"/>
+              <w:right w:type="dxa" w:w="80"/>
+            </w:tcMar>
+          </w:tcPr>
+          <w:p>
+            <w:pPr>
+              <w:spacing w:after="0" w:line="240"/>
+            </w:pPr>
+            <w:r>
+              <w:rPr>
+                <w:rFonts w:ascii="Calibri" w:cs="Calibri" w:eastAsia="Calibri" w:hAnsi="Calibri"/>
+                <w:sz w:val="16"/>
+                <w:szCs w:val="16"/>
+              </w:rPr>
+              <w:t xml:space="preserve">gh auth login signs in through the browser and stores credentials that git push uses too.</w:t>
+            </w:r>
+          </w:p>
+        </w:tc>
+      </w:tr>
+      <w:tr>
+        <w:trPr>
+          <w:cantSplit/>
+        </w:trPr>
+        <w:tc>
+          <w:tcPr>
+            <w:tcW w:type="dxa" w:w="1750"/>
+            <w:tcMar>
+              <w:top w:type="dxa" w:w="50"/>
+              <w:left w:type="dxa" w:w="80"/>
+              <w:bottom w:type="dxa" w:w="50"/>
+              <w:right w:type="dxa" w:w="80"/>
+            </w:tcMar>
+          </w:tcPr>
+          <w:p>
+            <w:pPr>
+              <w:spacing w:after="0"/>
+            </w:pPr>
+            <w:r>
+              <w:rPr>
+                <w:rFonts w:ascii="Calibri" w:cs="Calibri" w:eastAsia="Calibri" w:hAnsi="Calibri"/>
+                <w:b/>
+                <w:bCs/>
+                <w:sz w:val="18"/>
+                <w:szCs w:val="18"/>
+              </w:rPr>
+              <w:t xml:space="preserve">SSH key for GitHub</w:t>
+            </w:r>
+          </w:p>
+        </w:tc>
+        <w:tc>
+          <w:tcPr>
+            <w:tcW w:type="dxa" w:w="3250"/>
+            <w:tcMar>
+              <w:top w:type="dxa" w:w="50"/>
+              <w:left w:type="dxa" w:w="80"/>
+              <w:bottom w:type="dxa" w:w="50"/>
+              <w:right w:type="dxa" w:w="80"/>
+            </w:tcMar>
+          </w:tcPr>
+          <w:p>
+            <w:pPr>
+              <w:spacing w:after="30" w:line="240"/>
+            </w:pPr>
+            <w:r>
+              <w:rPr>
+                <w:rFonts w:ascii="Consolas" w:cs="Consolas" w:eastAsia="Consolas" w:hAnsi="Consolas"/>
+                <w:color w:val="1F2937"/>
+                <w:sz w:val="17"/>
+                <w:szCs w:val="17"/>
+              </w:rPr>
+              <w:t xml:space="preserve">ssh-keygen -t ed25519 -C "you@example.com"</w:t>
+            </w:r>
+          </w:p>
+          <w:p>
+            <w:pPr>
+              <w:spacing w:after="30" w:line="240"/>
+            </w:pPr>
+            <w:r>
+              <w:rPr>
+                <w:rFonts w:ascii="Consolas" w:cs="Consolas" w:eastAsia="Consolas" w:hAnsi="Consolas"/>
+                <w:color w:val="1F2937"/>
+                <w:sz w:val="17"/>
+                <w:szCs w:val="17"/>
+              </w:rPr>
+              <w:t xml:space="preserve">Get-Service ssh-agent | Set-Service -StartupType Automatic; Start-Service ssh-agent</w:t>
+            </w:r>
+            <w:r>
+              <w:rPr>
+                <w:sz w:val="17"/>
+                <w:szCs w:val="17"/>
+              </w:rPr>
+              <w:t xml:space="preserve"> </w:t>
+            </w:r>
+            <w:r>
+              <w:rPr>
+                <w:rFonts w:ascii="Calibri" w:cs="Calibri" w:eastAsia="Calibri" w:hAnsi="Calibri"/>
+                <w:i/>
+                <w:iCs/>
+                <w:color w:val="6B7280"/>
+                <w:sz w:val="16"/>
+                <w:szCs w:val="16"/>
+              </w:rPr>
+              <w:t xml:space="preserve">(PowerShell, </w:t>
+            </w:r>
+            <w:r>
+              <w:rPr>
+                <w:rFonts w:ascii="Segoe UI Emoji" w:cs="Segoe UI Emoji" w:eastAsia="Segoe UI Emoji" w:hAnsi="Segoe UI Emoji"/>
+                <w:sz w:val="16"/>
+                <w:szCs w:val="16"/>
+              </w:rPr>
+              <w:t xml:space="preserve">🔒</w:t>
+            </w:r>
+            <w:r>
+              <w:rPr>
+                <w:rFonts w:ascii="Calibri" w:cs="Calibri" w:eastAsia="Calibri" w:hAnsi="Calibri"/>
+                <w:i/>
+                <w:iCs/>
+                <w:color w:val="6B7280"/>
+                <w:sz w:val="16"/>
+                <w:szCs w:val="16"/>
+              </w:rPr>
+              <w:t xml:space="preserve"> admin)</w:t>
+            </w:r>
+          </w:p>
+          <w:p>
+            <w:pPr>
+              <w:spacing w:after="30" w:line="240"/>
+            </w:pPr>
+            <w:r>
+              <w:rPr>
+                <w:rFonts w:ascii="Consolas" w:cs="Consolas" w:eastAsia="Consolas" w:hAnsi="Consolas"/>
+                <w:color w:val="1F2937"/>
+                <w:sz w:val="17"/>
+                <w:szCs w:val="17"/>
+              </w:rPr>
+              <w:t xml:space="preserve">ssh-add $env:USERPROFILE\.ssh\id_ed25519</w:t>
+            </w:r>
+            <w:r>
+              <w:rPr>
+                <w:sz w:val="17"/>
+                <w:szCs w:val="17"/>
+              </w:rPr>
+              <w:t xml:space="preserve"> </w:t>
+            </w:r>
+            <w:r>
+              <w:rPr>
+                <w:rFonts w:ascii="Calibri" w:cs="Calibri" w:eastAsia="Calibri" w:hAnsi="Calibri"/>
+                <w:i/>
+                <w:iCs/>
+                <w:color w:val="6B7280"/>
+                <w:sz w:val="16"/>
+                <w:szCs w:val="16"/>
+              </w:rPr>
+              <w:t xml:space="preserve">(PowerShell)</w:t>
+            </w:r>
+          </w:p>
+          <w:p>
+            <w:pPr>
+              <w:spacing w:after="30" w:line="240"/>
+            </w:pPr>
+            <w:r>
+              <w:rPr>
+                <w:rFonts w:ascii="Consolas" w:cs="Consolas" w:eastAsia="Consolas" w:hAnsi="Consolas"/>
+                <w:color w:val="1F2937"/>
+                <w:sz w:val="17"/>
+                <w:szCs w:val="17"/>
+              </w:rPr>
+              <w:t xml:space="preserve">gh ssh-key add ~/.ssh/id_ed25519.pub</w:t>
+            </w:r>
+          </w:p>
+        </w:tc>
+        <w:tc>
+          <w:tcPr>
+            <w:tcW w:type="dxa" w:w="3700"/>
+            <w:tcMar>
+              <w:top w:type="dxa" w:w="50"/>
+              <w:left w:type="dxa" w:w="80"/>
+              <w:bottom w:type="dxa" w:w="50"/>
+              <w:right w:type="dxa" w:w="80"/>
+            </w:tcMar>
+          </w:tcPr>
+          <w:p>
+            <w:pPr>
+              <w:spacing w:after="30" w:line="240"/>
+            </w:pPr>
+            <w:r>
+              <w:rPr>
+                <w:rFonts w:ascii="Consolas" w:cs="Consolas" w:eastAsia="Consolas" w:hAnsi="Consolas"/>
+                <w:color w:val="1F2937"/>
+                <w:sz w:val="17"/>
+                <w:szCs w:val="17"/>
+              </w:rPr>
+              <w:t xml:space="preserve">ssh-keygen -t ed25519 -C "you@example.com"</w:t>
+            </w:r>
+          </w:p>
+          <w:p>
+            <w:pPr>
+              <w:spacing w:after="30" w:line="240"/>
+            </w:pPr>
+            <w:r>
+              <w:rPr>
+                <w:rFonts w:ascii="Consolas" w:cs="Consolas" w:eastAsia="Consolas" w:hAnsi="Consolas"/>
+                <w:color w:val="1F2937"/>
+                <w:sz w:val="17"/>
+                <w:szCs w:val="17"/>
+              </w:rPr>
+              <w:t xml:space="preserve">ssh-add --apple-use-keychain ~/.ssh/id_ed25519</w:t>
+            </w:r>
+          </w:p>
+          <w:p>
+            <w:pPr>
+              <w:spacing w:after="30" w:line="240"/>
+            </w:pPr>
+            <w:r>
+              <w:rPr>
+                <w:rFonts w:ascii="Consolas" w:cs="Consolas" w:eastAsia="Consolas" w:hAnsi="Consolas"/>
+                <w:color w:val="1F2937"/>
+                <w:sz w:val="17"/>
+                <w:szCs w:val="17"/>
+              </w:rPr>
+              <w:t xml:space="preserve">gh ssh-key add ~/.ssh/id_ed25519.pub</w:t>
+            </w:r>
+          </w:p>
+        </w:tc>
+        <w:tc>
+          <w:tcPr>
+            <w:tcW w:type="dxa" w:w="3300"/>
+            <w:tcMar>
+              <w:top w:type="dxa" w:w="50"/>
+              <w:left w:type="dxa" w:w="80"/>
+              <w:bottom w:type="dxa" w:w="50"/>
+              <w:right w:type="dxa" w:w="80"/>
+            </w:tcMar>
+          </w:tcPr>
+          <w:p>
+            <w:pPr>
+              <w:spacing w:after="30" w:line="240"/>
+            </w:pPr>
+            <w:r>
+              <w:rPr>
+                <w:rFonts w:ascii="Consolas" w:cs="Consolas" w:eastAsia="Consolas" w:hAnsi="Consolas"/>
+                <w:color w:val="1F2937"/>
+                <w:sz w:val="17"/>
+                <w:szCs w:val="17"/>
+              </w:rPr>
+              <w:t xml:space="preserve">ssh-keygen -t ed25519 -C "you@example.com"</w:t>
+            </w:r>
+          </w:p>
+          <w:p>
+            <w:pPr>
+              <w:spacing w:after="30" w:line="240"/>
+            </w:pPr>
+            <w:r>
+              <w:rPr>
+                <w:rFonts w:ascii="Consolas" w:cs="Consolas" w:eastAsia="Consolas" w:hAnsi="Consolas"/>
+                <w:color w:val="1F2937"/>
+                <w:sz w:val="17"/>
+                <w:szCs w:val="17"/>
+              </w:rPr>
+              <w:t xml:space="preserve">eval "$(ssh-agent -s)"; ssh-add ~/.ssh/id_ed25519</w:t>
+            </w:r>
+          </w:p>
+          <w:p>
+            <w:pPr>
+              <w:spacing w:after="30" w:line="240"/>
+            </w:pPr>
+            <w:r>
+              <w:rPr>
+                <w:rFonts w:ascii="Consolas" w:cs="Consolas" w:eastAsia="Consolas" w:hAnsi="Consolas"/>
+                <w:color w:val="1F2937"/>
+                <w:sz w:val="17"/>
+                <w:szCs w:val="17"/>
+              </w:rPr>
+              <w:t xml:space="preserve">gh ssh-key add ~/.ssh/id_ed25519.pub</w:t>
+            </w:r>
+          </w:p>
+        </w:tc>
+        <w:tc>
+          <w:tcPr>
+            <w:tcW w:type="dxa" w:w="2112"/>
+            <w:tcMar>
+              <w:top w:type="dxa" w:w="50"/>
+              <w:left w:type="dxa" w:w="80"/>
+              <w:bottom w:type="dxa" w:w="50"/>
+              <w:right w:type="dxa" w:w="80"/>
+            </w:tcMar>
+          </w:tcPr>
+          <w:p>
+            <w:pPr>
+              <w:spacing w:after="0" w:line="240"/>
+            </w:pPr>
+            <w:r>
+              <w:rPr>
+                <w:rFonts w:ascii="Calibri" w:cs="Calibri" w:eastAsia="Calibri" w:hAnsi="Calibri"/>
+                <w:sz w:val="16"/>
+                <w:szCs w:val="16"/>
+              </w:rPr>
+              <w:t xml:space="preserve">Test with ssh -T git@github.com. The Windows ssh-agent service is off by default.</w:t>
+            </w:r>
+          </w:p>
+        </w:tc>
+      </w:tr>
+      <w:tr>
+        <w:trPr>
+          <w:cantSplit/>
+        </w:trPr>
+        <w:tc>
+          <w:tcPr>
+            <w:tcW w:type="dxa" w:w="1750"/>
+            <w:shd w:fill="F3F5F7" w:color="auto" w:val="clear"/>
+            <w:tcMar>
+              <w:top w:type="dxa" w:w="50"/>
+              <w:left w:type="dxa" w:w="80"/>
+              <w:bottom w:type="dxa" w:w="50"/>
+              <w:right w:type="dxa" w:w="80"/>
+            </w:tcMar>
+          </w:tcPr>
+          <w:p>
+            <w:pPr>
+              <w:spacing w:after="0"/>
+            </w:pPr>
+            <w:r>
+              <w:rPr>
+                <w:rFonts w:ascii="Calibri" w:cs="Calibri" w:eastAsia="Calibri" w:hAnsi="Calibri"/>
+                <w:b/>
+                <w:bCs/>
+                <w:sz w:val="18"/>
+                <w:szCs w:val="18"/>
+              </w:rPr>
+              <w:t xml:space="preserve">Node.js</w:t>
+            </w:r>
+          </w:p>
+        </w:tc>
+        <w:tc>
+          <w:tcPr>
+            <w:tcW w:type="dxa" w:w="3250"/>
+            <w:shd w:fill="F3F5F7" w:color="auto" w:val="clear"/>
+            <w:tcMar>
+              <w:top w:type="dxa" w:w="50"/>
+              <w:left w:type="dxa" w:w="80"/>
+              <w:bottom w:type="dxa" w:w="50"/>
+              <w:right w:type="dxa" w:w="80"/>
+            </w:tcMar>
+          </w:tcPr>
+          <w:p>
+            <w:pPr>
+              <w:spacing w:after="30" w:line="240"/>
+            </w:pPr>
+            <w:r>
+              <w:rPr>
+                <w:rFonts w:ascii="Consolas" w:cs="Consolas" w:eastAsia="Consolas" w:hAnsi="Consolas"/>
+                <w:color w:val="1F2937"/>
+                <w:sz w:val="17"/>
+                <w:szCs w:val="17"/>
+              </w:rPr>
+              <w:t xml:space="preserve">winget install OpenJS.NodeJS.LTS</w:t>
+            </w:r>
+          </w:p>
+          <w:p>
+            <w:pPr>
+              <w:spacing w:after="30" w:line="240"/>
+            </w:pPr>
+            <w:r>
+              <w:rPr>
+                <w:rFonts w:ascii="Consolas" w:cs="Consolas" w:eastAsia="Consolas" w:hAnsi="Consolas"/>
+                <w:color w:val="1F2937"/>
+                <w:sz w:val="17"/>
+                <w:szCs w:val="17"/>
+              </w:rPr>
+              <w:t xml:space="preserve">winget install Schniz.fnm</w:t>
+            </w:r>
+            <w:r>
+              <w:rPr>
+                <w:sz w:val="17"/>
+                <w:szCs w:val="17"/>
+              </w:rPr>
+              <w:t xml:space="preserve"> </w:t>
+            </w:r>
+            <w:r>
+              <w:rPr>
+                <w:rFonts w:ascii="Calibri" w:cs="Calibri" w:eastAsia="Calibri" w:hAnsi="Calibri"/>
+                <w:i/>
+                <w:iCs/>
+                <w:color w:val="6B7280"/>
+                <w:sz w:val="16"/>
+                <w:szCs w:val="16"/>
+              </w:rPr>
+              <w:t xml:space="preserve">(version manager)</w:t>
+            </w:r>
+          </w:p>
+          <w:p>
+            <w:pPr>
+              <w:spacing w:after="30" w:line="240"/>
+            </w:pPr>
+            <w:r>
+              <w:rPr>
+                <w:rFonts w:ascii="Consolas" w:cs="Consolas" w:eastAsia="Consolas" w:hAnsi="Consolas"/>
+                <w:color w:val="1F2937"/>
+                <w:sz w:val="17"/>
+                <w:szCs w:val="17"/>
+              </w:rPr>
+              <w:t xml:space="preserve">node -v; npm -v</w:t>
+            </w:r>
+          </w:p>
+        </w:tc>
+        <w:tc>
+          <w:tcPr>
+            <w:tcW w:type="dxa" w:w="3700"/>
+            <w:shd w:fill="F3F5F7" w:color="auto" w:val="clear"/>
+            <w:tcMar>
+              <w:top w:type="dxa" w:w="50"/>
+              <w:left w:type="dxa" w:w="80"/>
+              <w:bottom w:type="dxa" w:w="50"/>
+              <w:right w:type="dxa" w:w="80"/>
+            </w:tcMar>
+          </w:tcPr>
+          <w:p>
+            <w:pPr>
+              <w:spacing w:after="30" w:line="240"/>
+            </w:pPr>
+            <w:r>
+              <w:rPr>
+                <w:rFonts w:ascii="Consolas" w:cs="Consolas" w:eastAsia="Consolas" w:hAnsi="Consolas"/>
+                <w:color w:val="1F2937"/>
+                <w:sz w:val="17"/>
+                <w:szCs w:val="17"/>
+              </w:rPr>
+              <w:t xml:space="preserve">brew install node</w:t>
+            </w:r>
+          </w:p>
+          <w:p>
+            <w:pPr>
+              <w:spacing w:after="30" w:line="240"/>
+            </w:pPr>
+            <w:r>
+              <w:rPr>
+                <w:rFonts w:ascii="Consolas" w:cs="Consolas" w:eastAsia="Consolas" w:hAnsi="Consolas"/>
+                <w:color w:val="1F2937"/>
+                <w:sz w:val="17"/>
+                <w:szCs w:val="17"/>
+              </w:rPr>
+              <w:t xml:space="preserve">brew install fnm</w:t>
+            </w:r>
+            <w:r>
+              <w:rPr>
+                <w:sz w:val="17"/>
+                <w:szCs w:val="17"/>
+              </w:rPr>
+              <w:t xml:space="preserve"> </w:t>
+            </w:r>
+            <w:r>
+              <w:rPr>
+                <w:rFonts w:ascii="Calibri" w:cs="Calibri" w:eastAsia="Calibri" w:hAnsi="Calibri"/>
+                <w:i/>
+                <w:iCs/>
+                <w:color w:val="6B7280"/>
+                <w:sz w:val="16"/>
+                <w:szCs w:val="16"/>
+              </w:rPr>
+              <w:t xml:space="preserve">(version manager)</w:t>
+            </w:r>
+          </w:p>
+        </w:tc>
+        <w:tc>
+          <w:tcPr>
+            <w:tcW w:type="dxa" w:w="3300"/>
+            <w:shd w:fill="F3F5F7" w:color="auto" w:val="clear"/>
+            <w:tcMar>
+              <w:top w:type="dxa" w:w="50"/>
+              <w:left w:type="dxa" w:w="80"/>
+              <w:bottom w:type="dxa" w:w="50"/>
+              <w:right w:type="dxa" w:w="80"/>
+            </w:tcMar>
+          </w:tcPr>
+          <w:p>
+            <w:pPr>
+              <w:spacing w:after="30" w:line="240"/>
+            </w:pPr>
+            <w:r>
+              <w:rPr>
+                <w:rFonts w:ascii="Consolas" w:cs="Consolas" w:eastAsia="Consolas" w:hAnsi="Consolas"/>
+                <w:color w:val="1F2937"/>
+                <w:sz w:val="17"/>
+                <w:szCs w:val="17"/>
+              </w:rPr>
+              <w:t xml:space="preserve">curl -fsSL https://fnm.vercel.app/install | bash</w:t>
+            </w:r>
+            <w:r>
+              <w:rPr>
+                <w:sz w:val="17"/>
+                <w:szCs w:val="17"/>
+              </w:rPr>
+              <w:t xml:space="preserve"> </w:t>
+            </w:r>
+            <w:r>
+              <w:rPr>
+                <w:rFonts w:ascii="Calibri" w:cs="Calibri" w:eastAsia="Calibri" w:hAnsi="Calibri"/>
+                <w:i/>
+                <w:iCs/>
+                <w:color w:val="6B7280"/>
+                <w:sz w:val="16"/>
+                <w:szCs w:val="16"/>
+              </w:rPr>
+              <w:t xml:space="preserve">(version manager)</w:t>
+            </w:r>
+          </w:p>
+          <w:p>
+            <w:pPr>
+              <w:spacing w:after="30" w:line="240"/>
+            </w:pPr>
+            <w:r>
+              <w:rPr>
+                <w:rFonts w:ascii="Consolas" w:cs="Consolas" w:eastAsia="Consolas" w:hAnsi="Consolas"/>
+                <w:color w:val="1F2937"/>
+                <w:sz w:val="17"/>
+                <w:szCs w:val="17"/>
+              </w:rPr>
+              <w:t xml:space="preserve">fnm install --lts</w:t>
+            </w:r>
+          </w:p>
+          <w:p>
+            <w:pPr>
+              <w:spacing w:after="30" w:line="240"/>
+            </w:pPr>
+            <w:r>
+              <w:rPr>
+                <w:rFonts w:ascii="Calibri" w:cs="Calibri" w:eastAsia="Calibri" w:hAnsi="Calibri"/>
+                <w:i/>
+                <w:iCs/>
+                <w:color w:val="6B7280"/>
+                <w:sz w:val="16"/>
+                <w:szCs w:val="16"/>
+              </w:rPr>
+              <w:t xml:space="preserve">(distro packages are often years old)</w:t>
+            </w:r>
+          </w:p>
+        </w:tc>
+        <w:tc>
+          <w:tcPr>
+            <w:tcW w:type="dxa" w:w="2112"/>
+            <w:shd w:fill="F3F5F7" w:color="auto" w:val="clear"/>
+            <w:tcMar>
+              <w:top w:type="dxa" w:w="50"/>
+              <w:left w:type="dxa" w:w="80"/>
+              <w:bottom w:type="dxa" w:w="50"/>
+              <w:right w:type="dxa" w:w="80"/>
+            </w:tcMar>
+          </w:tcPr>
+          <w:p>
+            <w:pPr>
+              <w:spacing w:after="0" w:line="240"/>
+            </w:pPr>
+            <w:r>
+              <w:rPr>
+                <w:rFonts w:ascii="Calibri" w:cs="Calibri" w:eastAsia="Calibri" w:hAnsi="Calibri"/>
+                <w:sz w:val="16"/>
+                <w:szCs w:val="16"/>
+              </w:rPr>
+              <w:t xml:space="preserve">A version manager such as fnm or nvm lets you switch Node versions per project.</w:t>
+            </w:r>
+          </w:p>
+        </w:tc>
+      </w:tr>
+      <w:tr>
+        <w:trPr>
+          <w:cantSplit/>
+        </w:trPr>
+        <w:tc>
+          <w:tcPr>
+            <w:tcW w:type="dxa" w:w="1750"/>
+            <w:tcMar>
+              <w:top w:type="dxa" w:w="50"/>
+              <w:left w:type="dxa" w:w="80"/>
+              <w:bottom w:type="dxa" w:w="50"/>
+              <w:right w:type="dxa" w:w="80"/>
+            </w:tcMar>
+          </w:tcPr>
+          <w:p>
+            <w:pPr>
+              <w:spacing w:after="0"/>
+            </w:pPr>
+            <w:r>
+              <w:rPr>
+                <w:rFonts w:ascii="Calibri" w:cs="Calibri" w:eastAsia="Calibri" w:hAnsi="Calibri"/>
+                <w:b/>
+                <w:bCs/>
+                <w:sz w:val="18"/>
+                <w:szCs w:val="18"/>
+              </w:rPr>
+              <w:t xml:space="preserve">Python</w:t>
+            </w:r>
+          </w:p>
+        </w:tc>
+        <w:tc>
+          <w:tcPr>
+            <w:tcW w:type="dxa" w:w="3250"/>
+            <w:tcMar>
+              <w:top w:type="dxa" w:w="50"/>
+              <w:left w:type="dxa" w:w="80"/>
+              <w:bottom w:type="dxa" w:w="50"/>
+              <w:right w:type="dxa" w:w="80"/>
+            </w:tcMar>
+          </w:tcPr>
+          <w:p>
+            <w:pPr>
+              <w:spacing w:after="30" w:line="240"/>
+            </w:pPr>
+            <w:r>
+              <w:rPr>
+                <w:rFonts w:ascii="Consolas" w:cs="Consolas" w:eastAsia="Consolas" w:hAnsi="Consolas"/>
+                <w:color w:val="1F2937"/>
+                <w:sz w:val="17"/>
+                <w:szCs w:val="17"/>
+              </w:rPr>
+              <w:t xml:space="preserve">winget install Python.Python.3.12</w:t>
+            </w:r>
+          </w:p>
+          <w:p>
+            <w:pPr>
+              <w:spacing w:after="30" w:line="240"/>
+            </w:pPr>
+            <w:r>
+              <w:rPr>
+                <w:rFonts w:ascii="Consolas" w:cs="Consolas" w:eastAsia="Consolas" w:hAnsi="Consolas"/>
+                <w:color w:val="1F2937"/>
+                <w:sz w:val="17"/>
+                <w:szCs w:val="17"/>
+              </w:rPr>
+              <w:t xml:space="preserve">python --version</w:t>
+            </w:r>
+          </w:p>
+          <w:p>
+            <w:pPr>
+              <w:spacing w:after="30" w:line="240"/>
+            </w:pPr>
+            <w:r>
+              <w:rPr>
+                <w:rFonts w:ascii="Consolas" w:cs="Consolas" w:eastAsia="Consolas" w:hAnsi="Consolas"/>
+                <w:color w:val="1F2937"/>
+                <w:sz w:val="17"/>
+                <w:szCs w:val="17"/>
+              </w:rPr>
+              <w:t xml:space="preserve">py -3</w:t>
+            </w:r>
+            <w:r>
+              <w:rPr>
+                <w:sz w:val="17"/>
+                <w:szCs w:val="17"/>
+              </w:rPr>
+              <w:t xml:space="preserve"> </w:t>
+            </w:r>
+            <w:r>
+              <w:rPr>
+                <w:rFonts w:ascii="Calibri" w:cs="Calibri" w:eastAsia="Calibri" w:hAnsi="Calibri"/>
+                <w:i/>
+                <w:iCs/>
+                <w:color w:val="6B7280"/>
+                <w:sz w:val="16"/>
+                <w:szCs w:val="16"/>
+              </w:rPr>
+              <w:t xml:space="preserve">(launcher; picks an installed version)</w:t>
+            </w:r>
+          </w:p>
+        </w:tc>
+        <w:tc>
+          <w:tcPr>
+            <w:tcW w:type="dxa" w:w="3700"/>
+            <w:tcMar>
+              <w:top w:type="dxa" w:w="50"/>
+              <w:left w:type="dxa" w:w="80"/>
+              <w:bottom w:type="dxa" w:w="50"/>
+              <w:right w:type="dxa" w:w="80"/>
+            </w:tcMar>
+          </w:tcPr>
+          <w:p>
+            <w:pPr>
+              <w:spacing w:after="30" w:line="240"/>
+            </w:pPr>
+            <w:r>
+              <w:rPr>
+                <w:rFonts w:ascii="Consolas" w:cs="Consolas" w:eastAsia="Consolas" w:hAnsi="Consolas"/>
+                <w:color w:val="1F2937"/>
+                <w:sz w:val="17"/>
+                <w:szCs w:val="17"/>
+              </w:rPr>
+              <w:t xml:space="preserve">brew install python</w:t>
+            </w:r>
+          </w:p>
+          <w:p>
+            <w:pPr>
+              <w:spacing w:after="30" w:line="240"/>
+            </w:pPr>
+            <w:r>
+              <w:rPr>
+                <w:rFonts w:ascii="Consolas" w:cs="Consolas" w:eastAsia="Consolas" w:hAnsi="Consolas"/>
+                <w:color w:val="1F2937"/>
+                <w:sz w:val="17"/>
+                <w:szCs w:val="17"/>
+              </w:rPr>
+              <w:t xml:space="preserve">python3 --version</w:t>
+            </w:r>
+          </w:p>
+        </w:tc>
+        <w:tc>
+          <w:tcPr>
+            <w:tcW w:type="dxa" w:w="3300"/>
+            <w:tcMar>
+              <w:top w:type="dxa" w:w="50"/>
+              <w:left w:type="dxa" w:w="80"/>
+              <w:bottom w:type="dxa" w:w="50"/>
+              <w:right w:type="dxa" w:w="80"/>
+            </w:tcMar>
+          </w:tcPr>
+          <w:p>
+            <w:pPr>
+              <w:spacing w:after="30" w:line="240"/>
+            </w:pPr>
+            <w:r>
+              <w:rPr>
+                <w:rFonts w:ascii="Consolas" w:cs="Consolas" w:eastAsia="Consolas" w:hAnsi="Consolas"/>
+                <w:color w:val="1F2937"/>
+                <w:sz w:val="17"/>
+                <w:szCs w:val="17"/>
+              </w:rPr>
+              <w:t xml:space="preserve">sudo apt install python3 python3-pip python3-venv</w:t>
+            </w:r>
+          </w:p>
+          <w:p>
+            <w:pPr>
+              <w:spacing w:after="30" w:line="240"/>
+            </w:pPr>
+            <w:r>
+              <w:rPr>
+                <w:rFonts w:ascii="Consolas" w:cs="Consolas" w:eastAsia="Consolas" w:hAnsi="Consolas"/>
+                <w:color w:val="1F2937"/>
+                <w:sz w:val="17"/>
+                <w:szCs w:val="17"/>
+              </w:rPr>
+              <w:t xml:space="preserve">python3 --version</w:t>
+            </w:r>
+          </w:p>
+        </w:tc>
+        <w:tc>
+          <w:tcPr>
+            <w:tcW w:type="dxa" w:w="2112"/>
+            <w:tcMar>
+              <w:top w:type="dxa" w:w="50"/>
+              <w:left w:type="dxa" w:w="80"/>
+              <w:bottom w:type="dxa" w:w="50"/>
+              <w:right w:type="dxa" w:w="80"/>
+            </w:tcMar>
+          </w:tcPr>
+          <w:p>
+            <w:pPr>
+              <w:spacing w:after="0" w:line="240"/>
+            </w:pPr>
+            <w:r>
+              <w:rPr>
+                <w:rFonts w:ascii="Calibri" w:cs="Calibri" w:eastAsia="Calibri" w:hAnsi="Calibri"/>
+                <w:sz w:val="16"/>
+                <w:szCs w:val="16"/>
+              </w:rPr>
+              <w:t xml:space="preserve">Per-project environment: python -m venv .venv, then .venv\Scripts\activate (Windows) or source .venv/bin/activate.</w:t>
+            </w:r>
+          </w:p>
+        </w:tc>
+      </w:tr>
+      <w:tr>
+        <w:trPr>
+          <w:cantSplit/>
+        </w:trPr>
+        <w:tc>
+          <w:tcPr>
+            <w:tcW w:type="dxa" w:w="1750"/>
+            <w:shd w:fill="F3F5F7" w:color="auto" w:val="clear"/>
+            <w:tcMar>
+              <w:top w:type="dxa" w:w="50"/>
+              <w:left w:type="dxa" w:w="80"/>
+              <w:bottom w:type="dxa" w:w="50"/>
+              <w:right w:type="dxa" w:w="80"/>
+            </w:tcMar>
+          </w:tcPr>
+          <w:p>
+            <w:pPr>
+              <w:spacing w:after="0"/>
+            </w:pPr>
+            <w:r>
+              <w:rPr>
+                <w:rFonts w:ascii="Calibri" w:cs="Calibri" w:eastAsia="Calibri" w:hAnsi="Calibri"/>
+                <w:b/>
+                <w:bCs/>
+                <w:sz w:val="18"/>
+                <w:szCs w:val="18"/>
+              </w:rPr>
+              <w:t xml:space="preserve">VS Code</w:t>
+            </w:r>
+          </w:p>
+        </w:tc>
+        <w:tc>
+          <w:tcPr>
+            <w:tcW w:type="dxa" w:w="3250"/>
+            <w:shd w:fill="F3F5F7" w:color="auto" w:val="clear"/>
+            <w:tcMar>
+              <w:top w:type="dxa" w:w="50"/>
+              <w:left w:type="dxa" w:w="80"/>
+              <w:bottom w:type="dxa" w:w="50"/>
+              <w:right w:type="dxa" w:w="80"/>
+            </w:tcMar>
+          </w:tcPr>
+          <w:p>
+            <w:pPr>
+              <w:spacing w:after="30" w:line="240"/>
+            </w:pPr>
+            <w:r>
+              <w:rPr>
+                <w:rFonts w:ascii="Consolas" w:cs="Consolas" w:eastAsia="Consolas" w:hAnsi="Consolas"/>
+                <w:color w:val="1F2937"/>
+                <w:sz w:val="17"/>
+                <w:szCs w:val="17"/>
+              </w:rPr>
+              <w:t xml:space="preserve">winget install Microsoft.VisualStudioCode</w:t>
+            </w:r>
+          </w:p>
+          <w:p>
+            <w:pPr>
+              <w:spacing w:after="30" w:line="240"/>
+            </w:pPr>
+            <w:r>
+              <w:rPr>
+                <w:rFonts w:ascii="Consolas" w:cs="Consolas" w:eastAsia="Consolas" w:hAnsi="Consolas"/>
+                <w:color w:val="1F2937"/>
+                <w:sz w:val="17"/>
+                <w:szCs w:val="17"/>
+              </w:rPr>
+              <w:t xml:space="preserve">code .</w:t>
+            </w:r>
+            <w:r>
+              <w:rPr>
+                <w:sz w:val="17"/>
+                <w:szCs w:val="17"/>
+              </w:rPr>
+              <w:t xml:space="preserve"> </w:t>
+            </w:r>
+            <w:r>
+              <w:rPr>
+                <w:rFonts w:ascii="Calibri" w:cs="Calibri" w:eastAsia="Calibri" w:hAnsi="Calibri"/>
+                <w:i/>
+                <w:iCs/>
+                <w:color w:val="6B7280"/>
+                <w:sz w:val="16"/>
+                <w:szCs w:val="16"/>
+              </w:rPr>
+              <w:t xml:space="preserve">(open the current folder)</w:t>
+            </w:r>
+          </w:p>
+        </w:tc>
+        <w:tc>
+          <w:tcPr>
+            <w:tcW w:type="dxa" w:w="3700"/>
+            <w:shd w:fill="F3F5F7" w:color="auto" w:val="clear"/>
+            <w:tcMar>
+              <w:top w:type="dxa" w:w="50"/>
+              <w:left w:type="dxa" w:w="80"/>
+              <w:bottom w:type="dxa" w:w="50"/>
+              <w:right w:type="dxa" w:w="80"/>
+            </w:tcMar>
+          </w:tcPr>
+          <w:p>
+            <w:pPr>
+              <w:spacing w:after="30" w:line="240"/>
+            </w:pPr>
+            <w:r>
+              <w:rPr>
+                <w:rFonts w:ascii="Consolas" w:cs="Consolas" w:eastAsia="Consolas" w:hAnsi="Consolas"/>
+                <w:color w:val="1F2937"/>
+                <w:sz w:val="17"/>
+                <w:szCs w:val="17"/>
+              </w:rPr>
+              <w:t xml:space="preserve">brew install --cask visual-studio-code</w:t>
+            </w:r>
+          </w:p>
+          <w:p>
+            <w:pPr>
+              <w:spacing w:after="30" w:line="240"/>
+            </w:pPr>
+            <w:r>
+              <w:rPr>
+                <w:rFonts w:ascii="Consolas" w:cs="Consolas" w:eastAsia="Consolas" w:hAnsi="Consolas"/>
+                <w:color w:val="1F2937"/>
+                <w:sz w:val="17"/>
+                <w:szCs w:val="17"/>
+              </w:rPr>
+              <w:t xml:space="preserve">code .</w:t>
+            </w:r>
+            <w:r>
+              <w:rPr>
+                <w:sz w:val="17"/>
+                <w:szCs w:val="17"/>
+              </w:rPr>
+              <w:t xml:space="preserve"> </w:t>
+            </w:r>
+            <w:r>
+              <w:rPr>
+                <w:rFonts w:ascii="Calibri" w:cs="Calibri" w:eastAsia="Calibri" w:hAnsi="Calibri"/>
+                <w:i/>
+                <w:iCs/>
+                <w:color w:val="6B7280"/>
+                <w:sz w:val="16"/>
+                <w:szCs w:val="16"/>
+              </w:rPr>
+              <w:t xml:space="preserve">(first run Shell Command: Install code from the Command Palette)</w:t>
+            </w:r>
+          </w:p>
+        </w:tc>
+        <w:tc>
+          <w:tcPr>
+            <w:tcW w:type="dxa" w:w="3300"/>
+            <w:shd w:fill="F3F5F7" w:color="auto" w:val="clear"/>
+            <w:tcMar>
+              <w:top w:type="dxa" w:w="50"/>
+              <w:left w:type="dxa" w:w="80"/>
+              <w:bottom w:type="dxa" w:w="50"/>
+              <w:right w:type="dxa" w:w="80"/>
+            </w:tcMar>
+          </w:tcPr>
+          <w:p>
+            <w:pPr>
+              <w:spacing w:after="30" w:line="240"/>
+            </w:pPr>
+            <w:r>
+              <w:rPr>
+                <w:rFonts w:ascii="Consolas" w:cs="Consolas" w:eastAsia="Consolas" w:hAnsi="Consolas"/>
+                <w:color w:val="1F2937"/>
+                <w:sz w:val="17"/>
+                <w:szCs w:val="17"/>
+              </w:rPr>
+              <w:t xml:space="preserve">sudo snap install code --classic</w:t>
+            </w:r>
+          </w:p>
+          <w:p>
+            <w:pPr>
+              <w:spacing w:after="30" w:line="240"/>
+            </w:pPr>
+            <w:r>
+              <w:rPr>
+                <w:rFonts w:ascii="Calibri" w:cs="Calibri" w:eastAsia="Calibri" w:hAnsi="Calibri"/>
+                <w:i/>
+                <w:iCs/>
+                <w:color w:val="6B7280"/>
+                <w:sz w:val="16"/>
+                <w:szCs w:val="16"/>
+              </w:rPr>
+              <w:t xml:space="preserve">(or the .deb / .rpm from code.visualstudio.com)</w:t>
+            </w:r>
+          </w:p>
+          <w:p>
+            <w:pPr>
+              <w:spacing w:after="30" w:line="240"/>
+            </w:pPr>
+            <w:r>
+              <w:rPr>
+                <w:rFonts w:ascii="Consolas" w:cs="Consolas" w:eastAsia="Consolas" w:hAnsi="Consolas"/>
+                <w:color w:val="1F2937"/>
+                <w:sz w:val="17"/>
+                <w:szCs w:val="17"/>
+              </w:rPr>
+              <w:t xml:space="preserve">code .</w:t>
+            </w:r>
+          </w:p>
+        </w:tc>
+        <w:tc>
+          <w:tcPr>
+            <w:tcW w:type="dxa" w:w="2112"/>
+            <w:shd w:fill="F3F5F7" w:color="auto" w:val="clear"/>
+            <w:tcMar>
+              <w:top w:type="dxa" w:w="50"/>
+              <w:left w:type="dxa" w:w="80"/>
+              <w:bottom w:type="dxa" w:w="50"/>
+              <w:right w:type="dxa" w:w="80"/>
+            </w:tcMar>
+          </w:tcPr>
+          <w:p>
+            <w:pPr>
+              <w:spacing w:after="0" w:line="240"/>
+            </w:pPr>
+          </w:p>
+        </w:tc>
+      </w:tr>
+      <w:tr>
+        <w:trPr>
+          <w:cantSplit/>
+        </w:trPr>
+        <w:tc>
+          <w:tcPr>
+            <w:tcW w:type="dxa" w:w="1750"/>
+            <w:tcMar>
+              <w:top w:type="dxa" w:w="50"/>
+              <w:left w:type="dxa" w:w="80"/>
+              <w:bottom w:type="dxa" w:w="50"/>
+              <w:right w:type="dxa" w:w="80"/>
+            </w:tcMar>
+          </w:tcPr>
+          <w:p>
+            <w:pPr>
+              <w:spacing w:after="0"/>
+            </w:pPr>
+            <w:r>
+              <w:rPr>
+                <w:rFonts w:ascii="Calibri" w:cs="Calibri" w:eastAsia="Calibri" w:hAnsi="Calibri"/>
+                <w:b/>
+                <w:bCs/>
+                <w:sz w:val="18"/>
+                <w:szCs w:val="18"/>
+              </w:rPr>
+              <w:t xml:space="preserve">PowerShell 7 and Windows Terminal</w:t>
+            </w:r>
+          </w:p>
+        </w:tc>
+        <w:tc>
+          <w:tcPr>
+            <w:tcW w:type="dxa" w:w="3250"/>
+            <w:tcMar>
+              <w:top w:type="dxa" w:w="50"/>
+              <w:left w:type="dxa" w:w="80"/>
+              <w:bottom w:type="dxa" w:w="50"/>
+              <w:right w:type="dxa" w:w="80"/>
+            </w:tcMar>
+          </w:tcPr>
+          <w:p>
+            <w:pPr>
+              <w:spacing w:after="30" w:line="240"/>
+            </w:pPr>
+            <w:r>
+              <w:rPr>
+                <w:rFonts w:ascii="Consolas" w:cs="Consolas" w:eastAsia="Consolas" w:hAnsi="Consolas"/>
+                <w:color w:val="1F2937"/>
+                <w:sz w:val="17"/>
+                <w:szCs w:val="17"/>
+              </w:rPr>
+              <w:t xml:space="preserve">winget install Microsoft.PowerShell</w:t>
+            </w:r>
+          </w:p>
+          <w:p>
+            <w:pPr>
+              <w:spacing w:after="30" w:line="240"/>
+            </w:pPr>
+            <w:r>
+              <w:rPr>
+                <w:rFonts w:ascii="Consolas" w:cs="Consolas" w:eastAsia="Consolas" w:hAnsi="Consolas"/>
+                <w:color w:val="1F2937"/>
+                <w:sz w:val="17"/>
+                <w:szCs w:val="17"/>
+              </w:rPr>
+              <w:t xml:space="preserve">winget install Microsoft.WindowsTerminal</w:t>
+            </w:r>
+          </w:p>
+          <w:p>
+            <w:pPr>
+              <w:spacing w:after="30" w:line="240"/>
+            </w:pPr>
+            <w:r>
+              <w:rPr>
+                <w:rFonts w:ascii="Consolas" w:cs="Consolas" w:eastAsia="Consolas" w:hAnsi="Consolas"/>
+                <w:color w:val="1F2937"/>
+                <w:sz w:val="17"/>
+                <w:szCs w:val="17"/>
+              </w:rPr>
+              <w:t xml:space="preserve">pwsh</w:t>
+            </w:r>
+            <w:r>
+              <w:rPr>
+                <w:sz w:val="17"/>
+                <w:szCs w:val="17"/>
+              </w:rPr>
+              <w:t xml:space="preserve"> </w:t>
+            </w:r>
+            <w:r>
+              <w:rPr>
+                <w:rFonts w:ascii="Calibri" w:cs="Calibri" w:eastAsia="Calibri" w:hAnsi="Calibri"/>
+                <w:i/>
+                <w:iCs/>
+                <w:color w:val="6B7280"/>
+                <w:sz w:val="16"/>
+                <w:szCs w:val="16"/>
+              </w:rPr>
+              <w:t xml:space="preserve">(start PowerShell 7)</w:t>
+            </w:r>
+          </w:p>
+        </w:tc>
+        <w:tc>
+          <w:tcPr>
+            <w:tcW w:type="dxa" w:w="3700"/>
+            <w:tcMar>
+              <w:top w:type="dxa" w:w="50"/>
+              <w:left w:type="dxa" w:w="80"/>
+              <w:bottom w:type="dxa" w:w="50"/>
+              <w:right w:type="dxa" w:w="80"/>
+            </w:tcMar>
+          </w:tcPr>
+          <w:p>
+            <w:pPr>
+              <w:spacing w:after="30" w:line="240"/>
+            </w:pPr>
+            <w:r>
+              <w:rPr>
+                <w:rFonts w:ascii="Consolas" w:cs="Consolas" w:eastAsia="Consolas" w:hAnsi="Consolas"/>
+                <w:color w:val="1F2937"/>
+                <w:sz w:val="17"/>
+                <w:szCs w:val="17"/>
+              </w:rPr>
+              <w:t xml:space="preserve">brew install --cask powershell</w:t>
+            </w:r>
+          </w:p>
+          <w:p>
+            <w:pPr>
+              <w:spacing w:after="30" w:line="240"/>
+            </w:pPr>
+            <w:r>
+              <w:rPr>
+                <w:rFonts w:ascii="Consolas" w:cs="Consolas" w:eastAsia="Consolas" w:hAnsi="Consolas"/>
+                <w:color w:val="1F2937"/>
+                <w:sz w:val="17"/>
+                <w:szCs w:val="17"/>
+              </w:rPr>
+              <w:t xml:space="preserve">pwsh</w:t>
+            </w:r>
+          </w:p>
+        </w:tc>
+        <w:tc>
+          <w:tcPr>
+            <w:tcW w:type="dxa" w:w="3300"/>
+            <w:tcMar>
+              <w:top w:type="dxa" w:w="50"/>
+              <w:left w:type="dxa" w:w="80"/>
+              <w:bottom w:type="dxa" w:w="50"/>
+              <w:right w:type="dxa" w:w="80"/>
+            </w:tcMar>
+          </w:tcPr>
+          <w:p>
+            <w:pPr>
+              <w:spacing w:after="30" w:line="240"/>
+            </w:pPr>
+            <w:r>
+              <w:rPr>
+                <w:rFonts w:ascii="Calibri" w:cs="Calibri" w:eastAsia="Calibri" w:hAnsi="Calibri"/>
+                <w:i/>
+                <w:iCs/>
+                <w:color w:val="6B7280"/>
+                <w:sz w:val="16"/>
+                <w:szCs w:val="16"/>
+              </w:rPr>
+              <w:t xml:space="preserve">(see Microsoft's install page for your distro)</w:t>
+            </w:r>
+          </w:p>
+          <w:p>
+            <w:pPr>
+              <w:spacing w:after="30" w:line="240"/>
+            </w:pPr>
+            <w:r>
+              <w:rPr>
+                <w:rFonts w:ascii="Consolas" w:cs="Consolas" w:eastAsia="Consolas" w:hAnsi="Consolas"/>
+                <w:color w:val="1F2937"/>
+                <w:sz w:val="17"/>
+                <w:szCs w:val="17"/>
+              </w:rPr>
+              <w:t xml:space="preserve">pwsh</w:t>
+            </w:r>
+          </w:p>
+        </w:tc>
+        <w:tc>
+          <w:tcPr>
+            <w:tcW w:type="dxa" w:w="2112"/>
+            <w:tcMar>
+              <w:top w:type="dxa" w:w="50"/>
+              <w:left w:type="dxa" w:w="80"/>
+              <w:bottom w:type="dxa" w:w="50"/>
+              <w:right w:type="dxa" w:w="80"/>
+            </w:tcMar>
+          </w:tcPr>
+          <w:p>
+            <w:pPr>
+              <w:spacing w:after="0" w:line="240"/>
+            </w:pPr>
+            <w:r>
+              <w:rPr>
+                <w:rFonts w:ascii="Calibri" w:cs="Calibri" w:eastAsia="Calibri" w:hAnsi="Calibri"/>
+                <w:sz w:val="16"/>
+                <w:szCs w:val="16"/>
+              </w:rPr>
+              <w:t xml:space="preserve">Windows PowerShell 5.1 is built in. PowerShell 7 (pwsh) is the current cross-platform version and installs alongside it. Windows 11 already includes Windows Terminal.</w:t>
+            </w:r>
+          </w:p>
+        </w:tc>
+      </w:tr>
+      <w:tr>
+        <w:trPr>
+          <w:cantSplit/>
+        </w:trPr>
+        <w:tc>
+          <w:tcPr>
+            <w:tcW w:type="dxa" w:w="1750"/>
+            <w:shd w:fill="F3F5F7" w:color="auto" w:val="clear"/>
+            <w:tcMar>
+              <w:top w:type="dxa" w:w="50"/>
+              <w:left w:type="dxa" w:w="80"/>
+              <w:bottom w:type="dxa" w:w="50"/>
+              <w:right w:type="dxa" w:w="80"/>
+            </w:tcMar>
+          </w:tcPr>
+          <w:p>
+            <w:pPr>
+              <w:spacing w:after="0"/>
+            </w:pPr>
+            <w:r>
+              <w:rPr>
+                <w:rFonts w:ascii="Calibri" w:cs="Calibri" w:eastAsia="Calibri" w:hAnsi="Calibri"/>
+                <w:b/>
+                <w:bCs/>
+                <w:sz w:val="18"/>
+                <w:szCs w:val="18"/>
+              </w:rPr>
+              <w:t xml:space="preserve">Compilers and build tools</w:t>
+            </w:r>
+          </w:p>
+        </w:tc>
+        <w:tc>
+          <w:tcPr>
+            <w:tcW w:type="dxa" w:w="3250"/>
+            <w:shd w:fill="F3F5F7" w:color="auto" w:val="clear"/>
+            <w:tcMar>
+              <w:top w:type="dxa" w:w="50"/>
+              <w:left w:type="dxa" w:w="80"/>
+              <w:bottom w:type="dxa" w:w="50"/>
+              <w:right w:type="dxa" w:w="80"/>
+            </w:tcMar>
+          </w:tcPr>
+          <w:p>
+            <w:pPr>
+              <w:spacing w:after="30" w:line="240"/>
+            </w:pPr>
+            <w:r>
+              <w:rPr>
+                <w:rFonts w:ascii="Consolas" w:cs="Consolas" w:eastAsia="Consolas" w:hAnsi="Consolas"/>
+                <w:color w:val="1F2937"/>
+                <w:sz w:val="17"/>
+                <w:szCs w:val="17"/>
+              </w:rPr>
+              <w:t xml:space="preserve">winget install Microsoft.VisualStudio.2022.BuildTools</w:t>
+            </w:r>
+          </w:p>
+          <w:p>
+            <w:pPr>
+              <w:spacing w:after="30" w:line="240"/>
+            </w:pPr>
+            <w:r>
+              <w:rPr>
+                <w:rFonts w:ascii="Calibri" w:cs="Calibri" w:eastAsia="Calibri" w:hAnsi="Calibri"/>
+                <w:i/>
+                <w:iCs/>
+                <w:color w:val="6B7280"/>
+                <w:sz w:val="16"/>
+                <w:szCs w:val="16"/>
+              </w:rPr>
+              <w:t xml:space="preserve">(choose "Desktop development with C++" in the installer)</w:t>
+            </w:r>
+          </w:p>
+        </w:tc>
+        <w:tc>
+          <w:tcPr>
+            <w:tcW w:type="dxa" w:w="3700"/>
+            <w:shd w:fill="F3F5F7" w:color="auto" w:val="clear"/>
+            <w:tcMar>
+              <w:top w:type="dxa" w:w="50"/>
+              <w:left w:type="dxa" w:w="80"/>
+              <w:bottom w:type="dxa" w:w="50"/>
+              <w:right w:type="dxa" w:w="80"/>
+            </w:tcMar>
+          </w:tcPr>
+          <w:p>
+            <w:pPr>
+              <w:spacing w:after="30" w:line="240"/>
+            </w:pPr>
+            <w:r>
+              <w:rPr>
+                <w:rFonts w:ascii="Consolas" w:cs="Consolas" w:eastAsia="Consolas" w:hAnsi="Consolas"/>
+                <w:color w:val="1F2937"/>
+                <w:sz w:val="17"/>
+                <w:szCs w:val="17"/>
+              </w:rPr>
+              <w:t xml:space="preserve">xcode-select --install</w:t>
+            </w:r>
+          </w:p>
+        </w:tc>
+        <w:tc>
+          <w:tcPr>
+            <w:tcW w:type="dxa" w:w="3300"/>
+            <w:shd w:fill="F3F5F7" w:color="auto" w:val="clear"/>
+            <w:tcMar>
+              <w:top w:type="dxa" w:w="50"/>
+              <w:left w:type="dxa" w:w="80"/>
+              <w:bottom w:type="dxa" w:w="50"/>
+              <w:right w:type="dxa" w:w="80"/>
+            </w:tcMar>
+          </w:tcPr>
+          <w:p>
+            <w:pPr>
+              <w:spacing w:after="30" w:line="240"/>
+            </w:pPr>
+            <w:r>
+              <w:rPr>
+                <w:rFonts w:ascii="Consolas" w:cs="Consolas" w:eastAsia="Consolas" w:hAnsi="Consolas"/>
+                <w:color w:val="1F2937"/>
+                <w:sz w:val="17"/>
+                <w:szCs w:val="17"/>
+              </w:rPr>
+              <w:t xml:space="preserve">sudo apt install build-essential</w:t>
+            </w:r>
+          </w:p>
+          <w:p>
+            <w:pPr>
+              <w:spacing w:after="30" w:line="240"/>
+            </w:pPr>
+            <w:r>
+              <w:rPr>
+                <w:rFonts w:ascii="Consolas" w:cs="Consolas" w:eastAsia="Consolas" w:hAnsi="Consolas"/>
+                <w:color w:val="1F2937"/>
+                <w:sz w:val="17"/>
+                <w:szCs w:val="17"/>
+              </w:rPr>
+              <w:t xml:space="preserve">sudo dnf groupinstall "Development Tools"</w:t>
+            </w:r>
+          </w:p>
+        </w:tc>
+        <w:tc>
+          <w:tcPr>
+            <w:tcW w:type="dxa" w:w="2112"/>
+            <w:shd w:fill="F3F5F7" w:color="auto" w:val="clear"/>
+            <w:tcMar>
+              <w:top w:type="dxa" w:w="50"/>
+              <w:left w:type="dxa" w:w="80"/>
+              <w:bottom w:type="dxa" w:w="50"/>
+              <w:right w:type="dxa" w:w="80"/>
+            </w:tcMar>
+          </w:tcPr>
+          <w:p>
+            <w:pPr>
+              <w:spacing w:after="0" w:line="240"/>
+            </w:pPr>
+            <w:r>
+              <w:rPr>
+                <w:rFonts w:ascii="Calibri" w:cs="Calibri" w:eastAsia="Calibri" w:hAnsi="Calibri"/>
+                <w:sz w:val="16"/>
+                <w:szCs w:val="16"/>
+              </w:rPr>
+              <w:t xml:space="preserve">Needed by npm and pip packages that compile native code.</w:t>
+            </w:r>
+          </w:p>
+        </w:tc>
+      </w:tr>
+      <w:tr>
+        <w:trPr>
+          <w:cantSplit/>
+        </w:trPr>
+        <w:tc>
+          <w:tcPr>
+            <w:tcW w:type="dxa" w:w="1750"/>
+            <w:tcMar>
+              <w:top w:type="dxa" w:w="50"/>
+              <w:left w:type="dxa" w:w="80"/>
+              <w:bottom w:type="dxa" w:w="50"/>
+              <w:right w:type="dxa" w:w="80"/>
+            </w:tcMar>
+          </w:tcPr>
+          <w:p>
+            <w:pPr>
+              <w:spacing w:after="0"/>
+            </w:pPr>
+            <w:r>
+              <w:rPr>
+                <w:rFonts w:ascii="Calibri" w:cs="Calibri" w:eastAsia="Calibri" w:hAnsi="Calibri"/>
+                <w:b/>
+                <w:bCs/>
+                <w:sz w:val="18"/>
+                <w:szCs w:val="18"/>
+              </w:rPr>
+              <w:t xml:space="preserve">Docker</w:t>
+            </w:r>
+          </w:p>
+        </w:tc>
+        <w:tc>
+          <w:tcPr>
+            <w:tcW w:type="dxa" w:w="3250"/>
+            <w:tcMar>
+              <w:top w:type="dxa" w:w="50"/>
+              <w:left w:type="dxa" w:w="80"/>
+              <w:bottom w:type="dxa" w:w="50"/>
+              <w:right w:type="dxa" w:w="80"/>
+            </w:tcMar>
+          </w:tcPr>
+          <w:p>
+            <w:pPr>
+              <w:spacing w:after="30" w:line="240"/>
+            </w:pPr>
+            <w:r>
+              <w:rPr>
+                <w:rFonts w:ascii="Consolas" w:cs="Consolas" w:eastAsia="Consolas" w:hAnsi="Consolas"/>
+                <w:color w:val="1F2937"/>
+                <w:sz w:val="17"/>
+                <w:szCs w:val="17"/>
+              </w:rPr>
+              <w:t xml:space="preserve">winget install Docker.DockerDesktop</w:t>
+            </w:r>
+          </w:p>
+          <w:p>
+            <w:pPr>
+              <w:spacing w:after="30" w:line="240"/>
+            </w:pPr>
+            <w:r>
+              <w:rPr>
+                <w:rFonts w:ascii="Consolas" w:cs="Consolas" w:eastAsia="Consolas" w:hAnsi="Consolas"/>
+                <w:color w:val="1F2937"/>
+                <w:sz w:val="17"/>
+                <w:szCs w:val="17"/>
+              </w:rPr>
+              <w:t xml:space="preserve">docker run hello-world</w:t>
+            </w:r>
+          </w:p>
+        </w:tc>
+        <w:tc>
+          <w:tcPr>
+            <w:tcW w:type="dxa" w:w="3700"/>
+            <w:tcMar>
+              <w:top w:type="dxa" w:w="50"/>
+              <w:left w:type="dxa" w:w="80"/>
+              <w:bottom w:type="dxa" w:w="50"/>
+              <w:right w:type="dxa" w:w="80"/>
+            </w:tcMar>
+          </w:tcPr>
+          <w:p>
+            <w:pPr>
+              <w:spacing w:after="30" w:line="240"/>
+            </w:pPr>
+            <w:r>
+              <w:rPr>
+                <w:rFonts w:ascii="Consolas" w:cs="Consolas" w:eastAsia="Consolas" w:hAnsi="Consolas"/>
+                <w:color w:val="1F2937"/>
+                <w:sz w:val="17"/>
+                <w:szCs w:val="17"/>
+              </w:rPr>
+              <w:t xml:space="preserve">brew install --cask docker</w:t>
+            </w:r>
+          </w:p>
+          <w:p>
+            <w:pPr>
+              <w:spacing w:after="30" w:line="240"/>
+            </w:pPr>
+            <w:r>
+              <w:rPr>
+                <w:rFonts w:ascii="Consolas" w:cs="Consolas" w:eastAsia="Consolas" w:hAnsi="Consolas"/>
+                <w:color w:val="1F2937"/>
+                <w:sz w:val="17"/>
+                <w:szCs w:val="17"/>
+              </w:rPr>
+              <w:t xml:space="preserve">docker run hello-world</w:t>
+            </w:r>
+          </w:p>
+        </w:tc>
+        <w:tc>
+          <w:tcPr>
+            <w:tcW w:type="dxa" w:w="3300"/>
+            <w:tcMar>
+              <w:top w:type="dxa" w:w="50"/>
+              <w:left w:type="dxa" w:w="80"/>
+              <w:bottom w:type="dxa" w:w="50"/>
+              <w:right w:type="dxa" w:w="80"/>
+            </w:tcMar>
+          </w:tcPr>
+          <w:p>
+            <w:pPr>
+              <w:spacing w:after="30" w:line="240"/>
+            </w:pPr>
+            <w:r>
+              <w:rPr>
+                <w:rFonts w:ascii="Consolas" w:cs="Consolas" w:eastAsia="Consolas" w:hAnsi="Consolas"/>
+                <w:color w:val="1F2937"/>
+                <w:sz w:val="17"/>
+                <w:szCs w:val="17"/>
+              </w:rPr>
+              <w:t xml:space="preserve">curl -fsSL https://get.docker.com | sh</w:t>
+            </w:r>
+          </w:p>
+          <w:p>
+            <w:pPr>
+              <w:spacing w:after="30" w:line="240"/>
+            </w:pPr>
+            <w:r>
+              <w:rPr>
+                <w:rFonts w:ascii="Consolas" w:cs="Consolas" w:eastAsia="Consolas" w:hAnsi="Consolas"/>
+                <w:color w:val="1F2937"/>
+                <w:sz w:val="17"/>
+                <w:szCs w:val="17"/>
+              </w:rPr>
+              <w:t xml:space="preserve">sudo usermod -aG docker $USER</w:t>
+            </w:r>
+            <w:r>
+              <w:rPr>
+                <w:sz w:val="17"/>
+                <w:szCs w:val="17"/>
+              </w:rPr>
+              <w:t xml:space="preserve"> </w:t>
+            </w:r>
+            <w:r>
+              <w:rPr>
+                <w:rFonts w:ascii="Calibri" w:cs="Calibri" w:eastAsia="Calibri" w:hAnsi="Calibri"/>
+                <w:i/>
+                <w:iCs/>
+                <w:color w:val="6B7280"/>
+                <w:sz w:val="16"/>
+                <w:szCs w:val="16"/>
+              </w:rPr>
+              <w:t xml:space="preserve">(then log out and in)</w:t>
+            </w:r>
+          </w:p>
+          <w:p>
+            <w:pPr>
+              <w:spacing w:after="30" w:line="240"/>
+            </w:pPr>
+            <w:r>
+              <w:rPr>
+                <w:rFonts w:ascii="Consolas" w:cs="Consolas" w:eastAsia="Consolas" w:hAnsi="Consolas"/>
+                <w:color w:val="1F2937"/>
+                <w:sz w:val="17"/>
+                <w:szCs w:val="17"/>
+              </w:rPr>
+              <w:t xml:space="preserve">docker run hello-world</w:t>
+            </w:r>
+          </w:p>
+        </w:tc>
+        <w:tc>
+          <w:tcPr>
+            <w:tcW w:type="dxa" w:w="2112"/>
+            <w:tcMar>
+              <w:top w:type="dxa" w:w="50"/>
+              <w:left w:type="dxa" w:w="80"/>
+              <w:bottom w:type="dxa" w:w="50"/>
+              <w:right w:type="dxa" w:w="80"/>
+            </w:tcMar>
+          </w:tcPr>
+          <w:p>
+            <w:pPr>
+              <w:spacing w:after="0" w:line="240"/>
+            </w:pPr>
+            <w:r>
+              <w:rPr>
+                <w:rFonts w:ascii="Calibri" w:cs="Calibri" w:eastAsia="Calibri" w:hAnsi="Calibri"/>
+                <w:sz w:val="16"/>
+                <w:szCs w:val="16"/>
+              </w:rPr>
+              <w:t xml:space="preserve">Docker Desktop on Windows runs on WSL 2, so install WSL first.</w:t>
+            </w:r>
+          </w:p>
+        </w:tc>
+      </w:tr>
+      <w:tr>
+        <w:trPr>
+          <w:cantSplit/>
+        </w:trPr>
+        <w:tc>
+          <w:tcPr>
+            <w:tcW w:type="dxa" w:w="1750"/>
+            <w:shd w:fill="F3F5F7" w:color="auto" w:val="clear"/>
+            <w:tcMar>
+              <w:top w:type="dxa" w:w="50"/>
+              <w:left w:type="dxa" w:w="80"/>
+              <w:bottom w:type="dxa" w:w="50"/>
+              <w:right w:type="dxa" w:w="80"/>
+            </w:tcMar>
+          </w:tcPr>
+          <w:p>
+            <w:pPr>
+              <w:spacing w:after="0"/>
+            </w:pPr>
+            <w:r>
+              <w:rPr>
+                <w:rFonts w:ascii="Calibri" w:cs="Calibri" w:eastAsia="Calibri" w:hAnsi="Calibri"/>
+                <w:b/>
+                <w:bCs/>
+                <w:sz w:val="18"/>
+                <w:szCs w:val="18"/>
+              </w:rPr>
+              <w:t xml:space="preserve">Allow PowerShell scripts</w:t>
+            </w:r>
+          </w:p>
+        </w:tc>
+        <w:tc>
+          <w:tcPr>
+            <w:tcW w:type="dxa" w:w="3250"/>
+            <w:shd w:fill="F3F5F7" w:color="auto" w:val="clear"/>
+            <w:tcMar>
+              <w:top w:type="dxa" w:w="50"/>
+              <w:left w:type="dxa" w:w="80"/>
+              <w:bottom w:type="dxa" w:w="50"/>
+              <w:right w:type="dxa" w:w="80"/>
+            </w:tcMar>
+          </w:tcPr>
+          <w:p>
+            <w:pPr>
+              <w:spacing w:after="30" w:line="240"/>
+            </w:pPr>
+            <w:r>
+              <w:rPr>
+                <w:rFonts w:ascii="Consolas" w:cs="Consolas" w:eastAsia="Consolas" w:hAnsi="Consolas"/>
+                <w:color w:val="1F2937"/>
+                <w:sz w:val="17"/>
+                <w:szCs w:val="17"/>
+              </w:rPr>
+              <w:t xml:space="preserve">Set-ExecutionPolicy RemoteSigned -Scope CurrentUser</w:t>
+            </w:r>
+            <w:r>
+              <w:rPr>
+                <w:sz w:val="17"/>
+                <w:szCs w:val="17"/>
+              </w:rPr>
+              <w:t xml:space="preserve"> </w:t>
+            </w:r>
+            <w:r>
+              <w:rPr>
+                <w:rFonts w:ascii="Calibri" w:cs="Calibri" w:eastAsia="Calibri" w:hAnsi="Calibri"/>
+                <w:i/>
+                <w:iCs/>
+                <w:color w:val="6B7280"/>
+                <w:sz w:val="16"/>
+                <w:szCs w:val="16"/>
+              </w:rPr>
+              <w:t xml:space="preserve">(PowerShell)</w:t>
+            </w:r>
+          </w:p>
+          <w:p>
+            <w:pPr>
+              <w:spacing w:after="30" w:line="240"/>
+            </w:pPr>
+            <w:r>
+              <w:rPr>
+                <w:rFonts w:ascii="Consolas" w:cs="Consolas" w:eastAsia="Consolas" w:hAnsi="Consolas"/>
+                <w:color w:val="1F2937"/>
+                <w:sz w:val="17"/>
+                <w:szCs w:val="17"/>
+              </w:rPr>
+              <w:t xml:space="preserve">Get-ExecutionPolicy -List</w:t>
+            </w:r>
+          </w:p>
+        </w:tc>
+        <w:tc>
+          <w:tcPr>
+            <w:tcW w:type="dxa" w:w="3700"/>
+            <w:shd w:fill="F3F5F7" w:color="auto" w:val="clear"/>
+            <w:tcMar>
+              <w:top w:type="dxa" w:w="50"/>
+              <w:left w:type="dxa" w:w="80"/>
+              <w:bottom w:type="dxa" w:w="50"/>
+              <w:right w:type="dxa" w:w="80"/>
+            </w:tcMar>
+          </w:tcPr>
+          <w:p>
+            <w:pPr>
+              <w:spacing w:after="30" w:line="240"/>
+            </w:pPr>
+            <w:r>
+              <w:rPr>
+                <w:rFonts w:ascii="Calibri" w:cs="Calibri" w:eastAsia="Calibri" w:hAnsi="Calibri"/>
+                <w:i/>
+                <w:iCs/>
+                <w:color w:val="6B7280"/>
+                <w:sz w:val="16"/>
+                <w:szCs w:val="16"/>
+              </w:rPr>
+              <w:t xml:space="preserve">(not needed)</w:t>
+            </w:r>
+          </w:p>
+        </w:tc>
+        <w:tc>
+          <w:tcPr>
+            <w:tcW w:type="dxa" w:w="3300"/>
+            <w:shd w:fill="F3F5F7" w:color="auto" w:val="clear"/>
+            <w:tcMar>
+              <w:top w:type="dxa" w:w="50"/>
+              <w:left w:type="dxa" w:w="80"/>
+              <w:bottom w:type="dxa" w:w="50"/>
+              <w:right w:type="dxa" w:w="80"/>
+            </w:tcMar>
+          </w:tcPr>
+          <w:p>
+            <w:pPr>
+              <w:spacing w:after="30" w:line="240"/>
+            </w:pPr>
+            <w:r>
+              <w:rPr>
+                <w:rFonts w:ascii="Calibri" w:cs="Calibri" w:eastAsia="Calibri" w:hAnsi="Calibri"/>
+                <w:i/>
+                <w:iCs/>
+                <w:color w:val="6B7280"/>
+                <w:sz w:val="16"/>
+                <w:szCs w:val="16"/>
+              </w:rPr>
+              <w:t xml:space="preserve">(not needed)</w:t>
+            </w:r>
+          </w:p>
+        </w:tc>
+        <w:tc>
+          <w:tcPr>
+            <w:tcW w:type="dxa" w:w="2112"/>
+            <w:shd w:fill="F3F5F7" w:color="auto" w:val="clear"/>
+            <w:tcMar>
+              <w:top w:type="dxa" w:w="50"/>
+              <w:left w:type="dxa" w:w="80"/>
+              <w:bottom w:type="dxa" w:w="50"/>
+              <w:right w:type="dxa" w:w="80"/>
+            </w:tcMar>
+          </w:tcPr>
+          <w:p>
+            <w:pPr>
+              <w:spacing w:after="0" w:line="240"/>
+            </w:pPr>
+            <w:r>
+              <w:rPr>
+                <w:rFonts w:ascii="Calibri" w:cs="Calibri" w:eastAsia="Calibri" w:hAnsi="Calibri"/>
+                <w:sz w:val="16"/>
+                <w:szCs w:val="16"/>
+              </w:rPr>
+              <w:t xml:space="preserve">Fixes "running scripts is disabled on this system". RemoteSigned runs local scripts and signed downloads only.</w:t>
+            </w:r>
+          </w:p>
+        </w:tc>
+      </w:tr>
+      <w:tr>
+        <w:trPr>
+          <w:cantSplit/>
+        </w:trPr>
+        <w:tc>
+          <w:tcPr>
+            <w:tcW w:type="dxa" w:w="1750"/>
+            <w:tcMar>
+              <w:top w:type="dxa" w:w="50"/>
+              <w:left w:type="dxa" w:w="80"/>
+              <w:bottom w:type="dxa" w:w="50"/>
+              <w:right w:type="dxa" w:w="80"/>
+            </w:tcMar>
+          </w:tcPr>
+          <w:p>
+            <w:pPr>
+              <w:spacing w:after="0"/>
+            </w:pPr>
+            <w:r>
+              <w:rPr>
+                <w:rFonts w:ascii="Calibri" w:cs="Calibri" w:eastAsia="Calibri" w:hAnsi="Calibri"/>
+                <w:b/>
+                <w:bCs/>
+                <w:sz w:val="18"/>
+                <w:szCs w:val="18"/>
+              </w:rPr>
+              <w:t xml:space="preserve">Check what is installed</w:t>
+            </w:r>
+          </w:p>
+        </w:tc>
+        <w:tc>
+          <w:tcPr>
+            <w:tcW w:type="dxa" w:w="3250"/>
+            <w:tcMar>
+              <w:top w:type="dxa" w:w="50"/>
+              <w:left w:type="dxa" w:w="80"/>
+              <w:bottom w:type="dxa" w:w="50"/>
+              <w:right w:type="dxa" w:w="80"/>
+            </w:tcMar>
+          </w:tcPr>
+          <w:p>
+            <w:pPr>
+              <w:spacing w:after="30" w:line="240"/>
+            </w:pPr>
+            <w:r>
+              <w:rPr>
+                <w:rFonts w:ascii="Consolas" w:cs="Consolas" w:eastAsia="Consolas" w:hAnsi="Consolas"/>
+                <w:color w:val="1F2937"/>
+                <w:sz w:val="17"/>
+                <w:szCs w:val="17"/>
+              </w:rPr>
+              <w:t xml:space="preserve">winget list</w:t>
+            </w:r>
+          </w:p>
+          <w:p>
+            <w:pPr>
+              <w:spacing w:after="30" w:line="240"/>
+            </w:pPr>
+            <w:r>
+              <w:rPr>
+                <w:rFonts w:ascii="Consolas" w:cs="Consolas" w:eastAsia="Consolas" w:hAnsi="Consolas"/>
+                <w:color w:val="1F2937"/>
+                <w:sz w:val="17"/>
+                <w:szCs w:val="17"/>
+              </w:rPr>
+              <w:t xml:space="preserve">git --version; node -v; python --version; code -v</w:t>
+            </w:r>
+          </w:p>
+          <w:p>
+            <w:pPr>
+              <w:spacing w:after="30" w:line="240"/>
+            </w:pPr>
+            <w:r>
+              <w:rPr>
+                <w:rFonts w:ascii="Consolas" w:cs="Consolas" w:eastAsia="Consolas" w:hAnsi="Consolas"/>
+                <w:color w:val="1F2937"/>
+                <w:sz w:val="17"/>
+                <w:szCs w:val="17"/>
+              </w:rPr>
+              <w:t xml:space="preserve">where git</w:t>
+            </w:r>
+            <w:r>
+              <w:rPr>
+                <w:sz w:val="17"/>
+                <w:szCs w:val="17"/>
+              </w:rPr>
+              <w:t xml:space="preserve"> </w:t>
+            </w:r>
+            <w:r>
+              <w:rPr>
+                <w:rFonts w:ascii="Calibri" w:cs="Calibri" w:eastAsia="Calibri" w:hAnsi="Calibri"/>
+                <w:i/>
+                <w:iCs/>
+                <w:color w:val="6B7280"/>
+                <w:sz w:val="16"/>
+                <w:szCs w:val="16"/>
+              </w:rPr>
+              <w:t xml:space="preserve">(path to the executable)</w:t>
+            </w:r>
+          </w:p>
+        </w:tc>
+        <w:tc>
+          <w:tcPr>
+            <w:tcW w:type="dxa" w:w="3700"/>
+            <w:tcMar>
+              <w:top w:type="dxa" w:w="50"/>
+              <w:left w:type="dxa" w:w="80"/>
+              <w:bottom w:type="dxa" w:w="50"/>
+              <w:right w:type="dxa" w:w="80"/>
+            </w:tcMar>
+          </w:tcPr>
+          <w:p>
+            <w:pPr>
+              <w:spacing w:after="30" w:line="240"/>
+            </w:pPr>
+            <w:r>
+              <w:rPr>
+                <w:rFonts w:ascii="Consolas" w:cs="Consolas" w:eastAsia="Consolas" w:hAnsi="Consolas"/>
+                <w:color w:val="1F2937"/>
+                <w:sz w:val="17"/>
+                <w:szCs w:val="17"/>
+              </w:rPr>
+              <w:t xml:space="preserve">brew list</w:t>
+            </w:r>
+          </w:p>
+          <w:p>
+            <w:pPr>
+              <w:spacing w:after="30" w:line="240"/>
+            </w:pPr>
+            <w:r>
+              <w:rPr>
+                <w:rFonts w:ascii="Consolas" w:cs="Consolas" w:eastAsia="Consolas" w:hAnsi="Consolas"/>
+                <w:color w:val="1F2937"/>
+                <w:sz w:val="17"/>
+                <w:szCs w:val="17"/>
+              </w:rPr>
+              <w:t xml:space="preserve">git --version; node -v; python3 --version</w:t>
+            </w:r>
+          </w:p>
+          <w:p>
+            <w:pPr>
+              <w:spacing w:after="30" w:line="240"/>
+            </w:pPr>
+            <w:r>
+              <w:rPr>
+                <w:rFonts w:ascii="Consolas" w:cs="Consolas" w:eastAsia="Consolas" w:hAnsi="Consolas"/>
+                <w:color w:val="1F2937"/>
+                <w:sz w:val="17"/>
+                <w:szCs w:val="17"/>
+              </w:rPr>
+              <w:t xml:space="preserve">which git</w:t>
+            </w:r>
+          </w:p>
+        </w:tc>
+        <w:tc>
+          <w:tcPr>
+            <w:tcW w:type="dxa" w:w="3300"/>
+            <w:tcMar>
+              <w:top w:type="dxa" w:w="50"/>
+              <w:left w:type="dxa" w:w="80"/>
+              <w:bottom w:type="dxa" w:w="50"/>
+              <w:right w:type="dxa" w:w="80"/>
+            </w:tcMar>
+          </w:tcPr>
+          <w:p>
+            <w:pPr>
+              <w:spacing w:after="30" w:line="240"/>
+            </w:pPr>
+            <w:r>
+              <w:rPr>
+                <w:rFonts w:ascii="Consolas" w:cs="Consolas" w:eastAsia="Consolas" w:hAnsi="Consolas"/>
+                <w:color w:val="1F2937"/>
+                <w:sz w:val="17"/>
+                <w:szCs w:val="17"/>
+              </w:rPr>
+              <w:t xml:space="preserve">apt list --installed 2&gt;/dev/null | grep -i git</w:t>
+            </w:r>
+          </w:p>
+          <w:p>
+            <w:pPr>
+              <w:spacing w:after="30" w:line="240"/>
+            </w:pPr>
+            <w:r>
+              <w:rPr>
+                <w:rFonts w:ascii="Consolas" w:cs="Consolas" w:eastAsia="Consolas" w:hAnsi="Consolas"/>
+                <w:color w:val="1F2937"/>
+                <w:sz w:val="17"/>
+                <w:szCs w:val="17"/>
+              </w:rPr>
+              <w:t xml:space="preserve">git --version; node -v; python3 --version</w:t>
+            </w:r>
+          </w:p>
+          <w:p>
+            <w:pPr>
+              <w:spacing w:after="30" w:line="240"/>
+            </w:pPr>
+            <w:r>
+              <w:rPr>
+                <w:rFonts w:ascii="Consolas" w:cs="Consolas" w:eastAsia="Consolas" w:hAnsi="Consolas"/>
+                <w:color w:val="1F2937"/>
+                <w:sz w:val="17"/>
+                <w:szCs w:val="17"/>
+              </w:rPr>
+              <w:t xml:space="preserve">which git</w:t>
+            </w:r>
+          </w:p>
+        </w:tc>
+        <w:tc>
+          <w:tcPr>
+            <w:tcW w:type="dxa" w:w="2112"/>
+            <w:tcMar>
+              <w:top w:type="dxa" w:w="50"/>
+              <w:left w:type="dxa" w:w="80"/>
+              <w:bottom w:type="dxa" w:w="50"/>
+              <w:right w:type="dxa" w:w="80"/>
+            </w:tcMar>
+          </w:tcPr>
+          <w:p>
+            <w:pPr>
+              <w:spacing w:after="0" w:line="240"/>
+            </w:pPr>
+            <w:r>
+              <w:rPr>
+                <w:rFonts w:ascii="Calibri" w:cs="Calibri" w:eastAsia="Calibri" w:hAnsi="Calibri"/>
+                <w:sz w:val="16"/>
+                <w:szCs w:val="16"/>
+              </w:rPr>
+              <w:t xml:space="preserve">After installing anything, open a new terminal window. Existing shells keep the old PATH.</w:t>
+            </w:r>
           </w:p>
         </w:tc>
       </w:tr>
@@ -36240,6 +39281,120 @@
           <w:szCs w:val="18"/>
         </w:rPr>
         <w:t xml:space="preserve">Windows Subsystem for Linux (wsl) gives you a real Linux shell on Windows. Windows drives appear under /mnt/c.</w:t>
+      </w:r>
+    </w:p>
+    <w:p>
+      <w:pPr>
+        <w:pStyle w:val="Heading3"/>
+        <w:keepNext/>
+        <w:spacing w:after="40" w:before="140"/>
+      </w:pPr>
+      <w:r>
+        <w:t xml:space="preserve">Setting up Windows for development</w:t>
+      </w:r>
+    </w:p>
+    <w:p>
+      <w:pPr>
+        <w:pStyle w:val="ListParagraph"/>
+        <w:numPr>
+          <w:ilvl w:val="0"/>
+          <w:numId w:val="2"/>
+        </w:numPr>
+        <w:spacing w:after="30" w:line="250"/>
+      </w:pPr>
+      <w:r>
+        <w:rPr>
+          <w:rFonts w:ascii="Calibri" w:cs="Calibri" w:eastAsia="Calibri" w:hAnsi="Calibri"/>
+          <w:sz w:val="18"/>
+          <w:szCs w:val="18"/>
+        </w:rPr>
+        <w:t xml:space="preserve">Turn on Developer Mode (Settings &gt; System &gt; For developers). It lets you create symlinks without an admin prompt and, on Windows 11 24H2+, enables the built-in sudo.</w:t>
+      </w:r>
+    </w:p>
+    <w:p>
+      <w:pPr>
+        <w:pStyle w:val="ListParagraph"/>
+        <w:numPr>
+          <w:ilvl w:val="0"/>
+          <w:numId w:val="2"/>
+        </w:numPr>
+        <w:spacing w:after="30" w:line="250"/>
+      </w:pPr>
+      <w:r>
+        <w:rPr>
+          <w:rFonts w:ascii="Calibri" w:cs="Calibri" w:eastAsia="Calibri" w:hAnsi="Calibri"/>
+          <w:sz w:val="18"/>
+          <w:szCs w:val="18"/>
+        </w:rPr>
+        <w:t xml:space="preserve">Long paths: node_modules trees often exceed the 260-character limit. Run git config --global core.longpaths true, and enable "Enable Win32 long paths" in Group Policy or set LongPathsEnabled=1 under HKLM\SYSTEM\CurrentControlSet\Control\FileSystem (</w:t>
+      </w:r>
+      <w:r>
+        <w:rPr>
+          <w:rFonts w:ascii="Segoe UI Emoji" w:cs="Segoe UI Emoji" w:eastAsia="Segoe UI Emoji" w:hAnsi="Segoe UI Emoji"/>
+          <w:sz w:val="18"/>
+          <w:szCs w:val="18"/>
+        </w:rPr>
+        <w:t xml:space="preserve">🔒</w:t>
+      </w:r>
+      <w:r>
+        <w:rPr>
+          <w:rFonts w:ascii="Calibri" w:cs="Calibri" w:eastAsia="Calibri" w:hAnsi="Calibri"/>
+          <w:sz w:val="18"/>
+          <w:szCs w:val="18"/>
+        </w:rPr>
+        <w:t xml:space="preserve"> admin).</w:t>
+      </w:r>
+    </w:p>
+    <w:p>
+      <w:pPr>
+        <w:pStyle w:val="ListParagraph"/>
+        <w:numPr>
+          <w:ilvl w:val="0"/>
+          <w:numId w:val="2"/>
+        </w:numPr>
+        <w:spacing w:after="30" w:line="250"/>
+      </w:pPr>
+      <w:r>
+        <w:rPr>
+          <w:rFonts w:ascii="Calibri" w:cs="Calibri" w:eastAsia="Calibri" w:hAnsi="Calibri"/>
+          <w:sz w:val="18"/>
+          <w:szCs w:val="18"/>
+        </w:rPr>
+        <w:t xml:space="preserve">winget installs per user by default; add --scope machine (</w:t>
+      </w:r>
+      <w:r>
+        <w:rPr>
+          <w:rFonts w:ascii="Segoe UI Emoji" w:cs="Segoe UI Emoji" w:eastAsia="Segoe UI Emoji" w:hAnsi="Segoe UI Emoji"/>
+          <w:sz w:val="18"/>
+          <w:szCs w:val="18"/>
+        </w:rPr>
+        <w:t xml:space="preserve">🔒</w:t>
+      </w:r>
+      <w:r>
+        <w:rPr>
+          <w:rFonts w:ascii="Calibri" w:cs="Calibri" w:eastAsia="Calibri" w:hAnsi="Calibri"/>
+          <w:sz w:val="18"/>
+          <w:szCs w:val="18"/>
+        </w:rPr>
+        <w:t xml:space="preserve"> admin) to install for everyone.</w:t>
+      </w:r>
+    </w:p>
+    <w:p>
+      <w:pPr>
+        <w:pStyle w:val="ListParagraph"/>
+        <w:numPr>
+          <w:ilvl w:val="0"/>
+          <w:numId w:val="2"/>
+        </w:numPr>
+        <w:spacing w:after="30" w:line="250"/>
+      </w:pPr>
+      <w:r>
+        <w:rPr>
+          <w:rFonts w:ascii="Calibri" w:cs="Calibri" w:eastAsia="Calibri" w:hAnsi="Calibri"/>
+          <w:sz w:val="18"/>
+          <w:szCs w:val="18"/>
+        </w:rPr>
+        <w:t xml:space="preserve">Most installers add themselves to the PATH, but only new terminal windows see it. If a command is "not recognized" right after installing, open a new window first.</w:t>
       </w:r>
     </w:p>
     <w:p>

</xml_diff>